<commit_message>
Add Movement I — The Ashes (Days 1-10)
The grief arc: naming the pain, understanding the blow-up as a physiological
event rather than a character failure, breaking the replay loop, separating
the person from the loss, writing the honest account, and closing with a
deliberate memorial so the loss stops being an open state.

Each chapter pairs one verse with one mechanism and ends in three spoken
affirmations and one small action. Research anchors: loss aversion, the dual
process model of grief, stress-driven loss of prefrontal control, rumination
vs reflection, affect labelling, self-compassion and self-improvement
motivation, shame vs guilt, expressive writing, psychological flexibility,
and the grief-ritual studies.

Co-Authored-By: Claude Opus 5 <noreply@anthropic.com>
Claude-Session: https://claude.ai/code/session_01UeeFz7e94QqjkRfBrfFPt4
</commit_message>
<xml_diff>
--- a/dist/restore-and-rebuild.docx
+++ b/dist/restore-and-rebuild.docx
@@ -1549,6 +1549,4471 @@
       </w:pPr>
       <w:r>
         <w:t>The wound is real, and I am not being asked to pretend otherwise — only to stop checking whether it has healed by pressing on it.</w:t>
+      </w:r>
+    </w:p>
+    <w:p>
+      <w:pPr>
+        <w:pStyle w:val="RRBodyText2"/>
+        <w:spacing w:after="0"/>
+      </w:pPr>
+      <w:r>
+        <w:br w:type="page"/>
+      </w:r>
+    </w:p>
+    <w:p>
+      <w:pPr>
+        <w:pStyle w:val="RRDayKicker"/>
+      </w:pPr>
+      <w:r>
+        <w:t>Day 2</w:t>
+      </w:r>
+    </w:p>
+    <w:p>
+      <w:pPr>
+        <w:pStyle w:val="RRDayTitle"/>
+      </w:pPr>
+      <w:r>
+        <w:t>This Is Grief, Not Weakness</w:t>
+      </w:r>
+    </w:p>
+    <w:p>
+      <w:pPr>
+        <w:pStyle w:val="RRSectionHead"/>
+      </w:pPr>
+      <w:r>
+        <w:t>The Word</w:t>
+      </w:r>
+    </w:p>
+    <w:p>
+      <w:pPr>
+        <w:pStyle w:val="RRVerse"/>
+      </w:pPr>
+      <w:r>
+        <w:t>For everything there is a season, and a time for every purpose under heaven … a time to weep, and a time to laugh; a time to mourn, and a time to dance.</w:t>
+      </w:r>
+    </w:p>
+    <w:p>
+      <w:pPr>
+        <w:pStyle w:val="RRVerseRef"/>
+      </w:pPr>
+      <w:r>
+        <w:t>Ecclesiastes 3:1, 4</w:t>
+      </w:r>
+    </w:p>
+    <w:p>
+      <w:pPr>
+        <w:pStyle w:val="RRSectionHead"/>
+      </w:pPr>
+      <w:r>
+        <w:t>Where You Are Today</w:t>
+      </w:r>
+    </w:p>
+    <w:p>
+      <w:pPr>
+        <w:pStyle w:val="RRBodyText2"/>
+      </w:pPr>
+      <w:r>
+        <w:t>Something strange happened yesterday, and it frightened you more than the crying did.</w:t>
+      </w:r>
+    </w:p>
+    <w:p>
+      <w:pPr>
+        <w:pStyle w:val="RRBodyText2"/>
+      </w:pPr>
+      <w:r>
+        <w:t xml:space="preserve">For about two hours you were fine. Genuinely fine. You were doing something ordinary — driving, or cooking, or half-watching something with the sound low — and the weight simply was not there. You laughed at something. And then, walking back into the room, it came down on you all at once, heavier than before, and you thought: </w:t>
+      </w:r>
+      <w:r>
+        <w:rPr>
+          <w:i/>
+        </w:rPr>
+        <w:t>I am getting worse.</w:t>
+      </w:r>
+    </w:p>
+    <w:p>
+      <w:pPr>
+        <w:pStyle w:val="RRBodyText2"/>
+      </w:pPr>
+      <w:r>
+        <w:t>You are not getting worse. What you experienced yesterday is the single most reliable sign that grief is proceeding normally, and almost nobody is told this in advance. So you are told it now, on Day 2, before the next swing arrives — because it will arrive, probably today.</w:t>
+      </w:r>
+    </w:p>
+    <w:p>
+      <w:pPr>
+        <w:pStyle w:val="RRSectionHead"/>
+      </w:pPr>
+      <w:r>
+        <w:t>What Is Happening In Your Brain</w:t>
+      </w:r>
+    </w:p>
+    <w:p>
+      <w:pPr>
+        <w:pStyle w:val="RRBodyText2"/>
+      </w:pPr>
+      <w:r>
+        <w:t>You have heard that grief comes in stages. Denial, anger, bargaining, depression, acceptance — five neat steps in a fixed order, and if you are doing it correctly you graduate from one to the next.</w:t>
+      </w:r>
+    </w:p>
+    <w:p>
+      <w:pPr>
+        <w:pStyle w:val="RRBodyText2"/>
+      </w:pPr>
+      <w:r>
+        <w:t>That model has been tested, and it does not hold up. When researchers actually tracked bereaved people over two years and measured those five states month by month, the sequence did not appear as advertised. Acceptance was not the final destination; it was present from very early and simply grew. The states rose and fell together rather than replacing one another in a queue. The stage model is a useful vocabulary and a poor map.</w:t>
+      </w:r>
+    </w:p>
+    <w:p>
+      <w:pPr>
+        <w:pStyle w:val="RRBodyText2"/>
+      </w:pPr>
+      <w:r>
+        <w:t xml:space="preserve">The model that survives contact with the evidence is different, and it explains your last two days exactly. Researchers call it the </w:t>
+      </w:r>
+      <w:r>
+        <w:rPr>
+          <w:b/>
+        </w:rPr>
+        <w:t>dual process model</w:t>
+      </w:r>
+      <w:r>
+        <w:t xml:space="preserve">, and its central claim is this: healthy grief </w:t>
+      </w:r>
+      <w:r>
+        <w:rPr>
+          <w:i/>
+        </w:rPr>
+        <w:t>oscillates</w:t>
+      </w:r>
+      <w:r>
+        <w:t>.</w:t>
+      </w:r>
+    </w:p>
+    <w:p>
+      <w:pPr>
+        <w:pStyle w:val="RRBodyText2"/>
+      </w:pPr>
+      <w:r>
+        <w:t xml:space="preserve">You swing between two modes. In one, you face the loss directly — you feel it, you replay it, you ache. In the other, you turn toward the ongoing business of living — you cook, you work, you get momentarily absorbed in something and forget. Both are necessary. And crucially, </w:t>
+      </w:r>
+      <w:r>
+        <w:rPr>
+          <w:b/>
+        </w:rPr>
+        <w:t>the oscillation itself is the mechanism of recovery.</w:t>
+      </w:r>
+      <w:r>
+        <w:t xml:space="preserve"> It is not that you grieve until you are finished and then resume life. It is that you alternate, in irregular bursts, and the alternation is what metabolises the loss.</w:t>
+      </w:r>
+    </w:p>
+    <w:p>
+      <w:pPr>
+        <w:pStyle w:val="RRBodyText2"/>
+      </w:pPr>
+      <w:r>
+        <w:t xml:space="preserve">This means the two hours of feeling fine were not a break from the work. They </w:t>
+      </w:r>
+      <w:r>
+        <w:rPr>
+          <w:i/>
+        </w:rPr>
+        <w:t>were</w:t>
+      </w:r>
+      <w:r>
+        <w:t xml:space="preserve"> the work. And the crash afterwards was not evidence that the fine hours were fake. It was simply the swing back.</w:t>
+      </w:r>
+    </w:p>
+    <w:p>
+      <w:pPr>
+        <w:pStyle w:val="RRBodyText2"/>
+      </w:pPr>
+      <w:r>
+        <w:t>Here is why this matters more for you than for most mourners. Traders are pattern-readers by profession. You will look at your own emotional state the way you look at a chart, and you will draw a trend line through three days of data and conclude you are heading somewhere terrible. Do not trade your own grief. The series is far too noisy for that, and it is supposed to be.</w:t>
+      </w:r>
+    </w:p>
+    <w:p>
+      <w:pPr>
+        <w:pStyle w:val="RRSectionHead"/>
+      </w:pPr>
+      <w:r>
+        <w:t>What the Word Says To It</w:t>
+      </w:r>
+    </w:p>
+    <w:p>
+      <w:pPr>
+        <w:pStyle w:val="RRBodyText2"/>
+      </w:pPr>
+      <w:r>
+        <w:t>The Preacher of Ecclesiastes gives us a list of opposites — weeping and laughing, mourning and dancing — and he does not rank them. He does not say that weeping is the immature phase you pass through on the way to dancing. He says both have a season, and that the seasons belong to a single ordered whole under heaven.</w:t>
+      </w:r>
+    </w:p>
+    <w:p>
+      <w:pPr>
+        <w:pStyle w:val="RRBodyText2"/>
+      </w:pPr>
+      <w:r>
+        <w:t>Notice the assumption underneath: that a life includes both, and that a person moving between them is not malfunctioning but living in time, as creatures do. Seasons are not a failure of the weather to settle down.</w:t>
+      </w:r>
+    </w:p>
+    <w:p>
+      <w:pPr>
+        <w:pStyle w:val="RRBodyText2"/>
+      </w:pPr>
+      <w:r>
+        <w:t xml:space="preserve">There is enormous permission in that verse for a person like you. You do not owe anyone a steady state. You are allowed to laugh on Tuesday and be flattened on Wednesday, and neither one cancels the other or proves anything about your character. What you are calling instability, Scripture calls a season, and what you are calling weakness, it simply calls </w:t>
+      </w:r>
+      <w:r>
+        <w:rPr>
+          <w:i/>
+        </w:rPr>
+        <w:t>a time to mourn</w:t>
+      </w:r>
+      <w:r>
+        <w:t>.</w:t>
+      </w:r>
+    </w:p>
+    <w:p>
+      <w:pPr>
+        <w:pStyle w:val="RRSectionHead"/>
+      </w:pPr>
+      <w:r>
+        <w:t>The Meditation</w:t>
+      </w:r>
+    </w:p>
+    <w:p>
+      <w:pPr>
+        <w:pStyle w:val="RRMeditation"/>
+      </w:pPr>
+      <w:r>
+        <w:t>Four minutes. Sit with your back supported. Let your shoulders drop — most people carrying this are holding their shoulders up near their ears without knowing it. Check yours now.</w:t>
+      </w:r>
+    </w:p>
+    <w:p>
+      <w:pPr>
+        <w:pStyle w:val="RRMeditation"/>
+      </w:pPr>
+      <w:r>
+        <w:t>Breathe in for four. Out for six. Six times, slowly.</w:t>
+      </w:r>
+    </w:p>
+    <w:p>
+      <w:pPr>
+        <w:pStyle w:val="RRMeditation"/>
+      </w:pPr>
+      <w:r>
+        <w:t xml:space="preserve">Now, instead of resisting the swing, name where you are on it. Say inwardly: </w:t>
+      </w:r>
+      <w:r>
+        <w:rPr>
+          <w:i/>
+        </w:rPr>
+        <w:t>Right now I am in the ache</w:t>
+      </w:r>
+      <w:r>
+        <w:t xml:space="preserve"> — or — </w:t>
+      </w:r>
+      <w:r>
+        <w:rPr>
+          <w:i/>
+        </w:rPr>
+        <w:t>Right now I am in the quiet.</w:t>
+      </w:r>
+      <w:r>
+        <w:t xml:space="preserve"> Neither one is the correct answer. You are only reading the instrument, not judging it.</w:t>
+      </w:r>
+    </w:p>
+    <w:p>
+      <w:pPr>
+        <w:pStyle w:val="RRMeditation"/>
+      </w:pPr>
+      <w:r>
+        <w:t>Then rest on this line, and let it repeat itself as slowly as it wants:</w:t>
+      </w:r>
+    </w:p>
+    <w:p>
+      <w:pPr>
+        <w:pStyle w:val="RRMeditation"/>
+      </w:pPr>
+      <w:r>
+        <w:rPr>
+          <w:i/>
+        </w:rPr>
+        <w:t>“A time to mourn, and a time to dance.”</w:t>
+      </w:r>
+    </w:p>
+    <w:p>
+      <w:pPr>
+        <w:pStyle w:val="RRMeditation"/>
+      </w:pPr>
+      <w:r>
+        <w:t>When you notice you have drifted into planning or replaying, come back to the line. Not with irritation. The way you would guide a child back to a path — a hand on the shoulder, no lecture.</w:t>
+      </w:r>
+    </w:p>
+    <w:p>
+      <w:pPr>
+        <w:pStyle w:val="RRMeditation"/>
+      </w:pPr>
+      <w:r>
+        <w:t>Close with one long exhale.</w:t>
+      </w:r>
+    </w:p>
+    <w:p>
+      <w:pPr>
+        <w:pStyle w:val="RRSectionHead"/>
+      </w:pPr>
+      <w:r>
+        <w:t>Say It Out Loud</w:t>
+      </w:r>
+    </w:p>
+    <w:p>
+      <w:pPr>
+        <w:pStyle w:val="RRAffirmation"/>
+      </w:pPr>
+      <w:r>
+        <w:t>“My grief moves in waves, and the wave going out is not the wave lying to me.”</w:t>
+      </w:r>
+    </w:p>
+    <w:p>
+      <w:pPr>
+        <w:pStyle w:val="RRAffirmation"/>
+      </w:pPr>
+      <w:r>
+        <w:t>“There is a season for this, and being in it does not mean I am failing at it.”</w:t>
+      </w:r>
+    </w:p>
+    <w:p>
+      <w:pPr>
+        <w:pStyle w:val="RRAffirmation"/>
+      </w:pPr>
+      <w:r>
+        <w:t>“I will not draw a trend line through three days of my own heart.”</w:t>
+      </w:r>
+    </w:p>
+    <w:p>
+      <w:pPr>
+        <w:pStyle w:val="RRSectionHead"/>
+      </w:pPr>
+      <w:r>
+        <w:t>Today’s Small Thing</w:t>
+      </w:r>
+    </w:p>
+    <w:p>
+      <w:pPr>
+        <w:pStyle w:val="RRBodyText2"/>
+      </w:pPr>
+      <w:r>
+        <w:t>Tell one person one true sentence about how you actually are.</w:t>
+      </w:r>
+    </w:p>
+    <w:p>
+      <w:pPr>
+        <w:pStyle w:val="RRBodyText2"/>
+      </w:pPr>
+      <w:r>
+        <w:t xml:space="preserve">Not the whole story. Not the number. One sentence, to one human being who knows your name — </w:t>
+      </w:r>
+      <w:r>
+        <w:rPr>
+          <w:i/>
+        </w:rPr>
+        <w:t>I lost a lot of money and I am not doing well</w:t>
+      </w:r>
+      <w:r>
+        <w:t xml:space="preserve"> — and then let it be awkward, and let them respond however they respond.</w:t>
+      </w:r>
+    </w:p>
+    <w:p>
+      <w:pPr>
+        <w:pStyle w:val="RRBodyText2"/>
+      </w:pPr>
+      <w:r>
+        <w:t>You are not asking for advice. You are breaking the seal.</w:t>
+      </w:r>
+    </w:p>
+    <w:p>
+      <w:pPr>
+        <w:pStyle w:val="RRSectionHead"/>
+      </w:pPr>
+      <w:r>
+        <w:t>Carry This</w:t>
+      </w:r>
+    </w:p>
+    <w:p>
+      <w:pPr>
+        <w:pStyle w:val="RRCarryThis"/>
+      </w:pPr>
+      <w:r>
+        <w:t>The good hours are not a betrayal of the grief, and the bad hours are not a verdict on my future.</w:t>
+      </w:r>
+    </w:p>
+    <w:p>
+      <w:pPr>
+        <w:pStyle w:val="RRBodyText2"/>
+        <w:spacing w:after="0"/>
+      </w:pPr>
+      <w:r>
+        <w:br w:type="page"/>
+      </w:r>
+    </w:p>
+    <w:p>
+      <w:pPr>
+        <w:pStyle w:val="RRDayKicker"/>
+      </w:pPr>
+      <w:r>
+        <w:t>Day 3</w:t>
+      </w:r>
+    </w:p>
+    <w:p>
+      <w:pPr>
+        <w:pStyle w:val="RRDayTitle"/>
+      </w:pPr>
+      <w:r>
+        <w:t>Your Brain on Blow-Up</w:t>
+      </w:r>
+    </w:p>
+    <w:p>
+      <w:pPr>
+        <w:pStyle w:val="RRSectionHead"/>
+      </w:pPr>
+      <w:r>
+        <w:t>The Word</w:t>
+      </w:r>
+    </w:p>
+    <w:p>
+      <w:pPr>
+        <w:pStyle w:val="RRVerse"/>
+      </w:pPr>
+      <w:r>
+        <w:t>Why are you in despair, my soul? Why are you disturbed within me? Hope in God! For I shall still praise him.</w:t>
+      </w:r>
+    </w:p>
+    <w:p>
+      <w:pPr>
+        <w:pStyle w:val="RRVerseRef"/>
+      </w:pPr>
+      <w:r>
+        <w:t>Psalm 42:11</w:t>
+      </w:r>
+    </w:p>
+    <w:p>
+      <w:pPr>
+        <w:pStyle w:val="RRSectionHead"/>
+      </w:pPr>
+      <w:r>
+        <w:t>Where You Are Today</w:t>
+      </w:r>
+    </w:p>
+    <w:p>
+      <w:pPr>
+        <w:pStyle w:val="RRBodyText2"/>
+      </w:pPr>
+      <w:r>
+        <w:t>There is one question you cannot stop asking, and it has no answer at three in the morning.</w:t>
+      </w:r>
+    </w:p>
+    <w:p>
+      <w:pPr>
+        <w:pStyle w:val="RRBodyText2"/>
+      </w:pPr>
+      <w:r>
+        <w:rPr>
+          <w:i/>
+        </w:rPr>
+        <w:t>Why didn’t I just close it?</w:t>
+      </w:r>
+    </w:p>
+    <w:p>
+      <w:pPr>
+        <w:pStyle w:val="RRBodyText2"/>
+      </w:pPr>
+      <w:r>
+        <w:t>You knew the level. You had written the level down. You had said the level out loud to somebody. And then the moment came, and you sat there and watched it go through, and you did nothing — or worse, you did the opposite of nothing, and added. And the part that torments you is not the money. It is that you cannot reconstruct the reasoning. You go looking for the trader who made that decision and you cannot find him. There is a hole where his thinking should be.</w:t>
+      </w:r>
+    </w:p>
+    <w:p>
+      <w:pPr>
+        <w:pStyle w:val="RRBodyText2"/>
+      </w:pPr>
+      <w:r>
+        <w:t>That hole is the most important thing in this book, so today we are going to look straight into it.</w:t>
+      </w:r>
+    </w:p>
+    <w:p>
+      <w:pPr>
+        <w:pStyle w:val="RRSectionHead"/>
+      </w:pPr>
+      <w:r>
+        <w:t>What Is Happening In Your Brain</w:t>
+      </w:r>
+    </w:p>
+    <w:p>
+      <w:pPr>
+        <w:pStyle w:val="RRBodyText2"/>
+      </w:pPr>
+      <w:r>
+        <w:t xml:space="preserve">You did not have access to your rules. Not </w:t>
+      </w:r>
+      <w:r>
+        <w:rPr>
+          <w:i/>
+        </w:rPr>
+        <w:t>chose to ignore</w:t>
+      </w:r>
+      <w:r>
+        <w:t xml:space="preserve"> — did not have access.</w:t>
+      </w:r>
+    </w:p>
+    <w:p>
+      <w:pPr>
+        <w:pStyle w:val="RRBodyText2"/>
+      </w:pPr>
+      <w:r>
+        <w:t xml:space="preserve">Under acute stress, your brain does not degrade evenly, like a car running out of fuel. It </w:t>
+      </w:r>
+      <w:r>
+        <w:rPr>
+          <w:b/>
+        </w:rPr>
+        <w:t>hands control from one system to another</w:t>
+      </w:r>
+      <w:r>
+        <w:t>. Two things happen almost at once.</w:t>
+      </w:r>
+    </w:p>
+    <w:p>
+      <w:pPr>
+        <w:pStyle w:val="RRBodyText2"/>
+      </w:pPr>
+      <w:r>
+        <w:t>First, stress chemistry floods the prefrontal cortex — the region behind your forehead responsible for holding a plan in mind, weighing consequences, and inhibiting an impulse. Neuroscientist Amy Arnsten’s work shows that high levels of stress neurochemicals rapidly impair exactly this region. Not metaphorically. The circuits that hold your trading rules in working memory go offline first, and they go offline fastest.</w:t>
+      </w:r>
+    </w:p>
+    <w:p>
+      <w:pPr>
+        <w:pStyle w:val="RRBodyText2"/>
+      </w:pPr>
+      <w:r>
+        <w:t xml:space="preserve">Second, and more unsettling: as the thinking system fades, control shifts to the </w:t>
+      </w:r>
+      <w:r>
+        <w:rPr>
+          <w:b/>
+        </w:rPr>
+        <w:t>habit system</w:t>
+      </w:r>
+      <w:r>
+        <w:t xml:space="preserve"> — older, deeper structures that execute well-learned routines without deliberation. Researchers have shown this experimentally. Stress a person, and their behaviour flips from goal-directed to habitual. They stop acting on what they </w:t>
+      </w:r>
+      <w:r>
+        <w:rPr>
+          <w:i/>
+        </w:rPr>
+        <w:t>want</w:t>
+      </w:r>
+      <w:r>
+        <w:t xml:space="preserve"> and start acting on what they have </w:t>
+      </w:r>
+      <w:r>
+        <w:rPr>
+          <w:i/>
+        </w:rPr>
+        <w:t>repeatedly done</w:t>
+      </w:r>
+      <w:r>
+        <w:t>.</w:t>
+      </w:r>
+    </w:p>
+    <w:p>
+      <w:pPr>
+        <w:pStyle w:val="RRBodyText2"/>
+      </w:pPr>
+      <w:r>
+        <w:t>Now put those two together and read your own blow-up again.</w:t>
+      </w:r>
+    </w:p>
+    <w:p>
+      <w:pPr>
+        <w:pStyle w:val="RRBodyText2"/>
+      </w:pPr>
+      <w:r>
+        <w:t xml:space="preserve">The stress spiked. The rule-holding system went dark. And control passed to the part of you that had rehearsed one particular routine thousands of times — the routine of </w:t>
+      </w:r>
+      <w:r>
+        <w:rPr>
+          <w:i/>
+        </w:rPr>
+        <w:t>staying in and being right</w:t>
+      </w:r>
+      <w:r>
+        <w:t>. Every time you have ever held through a drawdown and been vindicated, you were quietly training that habit. It was waiting. And on the day your prefrontal cortex went offline, it took the wheel, and it drove exactly where it had always driven.</w:t>
+      </w:r>
+    </w:p>
+    <w:p>
+      <w:pPr>
+        <w:pStyle w:val="RRBodyText2"/>
+      </w:pPr>
+      <w:r>
+        <w:t xml:space="preserve">This is not an excuse and I am not offering it as one. You are responsible for what happened; Day 8 will hold you to that in detail. But responsibility and explanation are different things, and you have been trying to explain your behaviour with a model — </w:t>
+      </w:r>
+      <w:r>
+        <w:rPr>
+          <w:i/>
+        </w:rPr>
+        <w:t>I knew better and chose wrong</w:t>
+      </w:r>
+      <w:r>
+        <w:t xml:space="preserve"> — that is simply not how the machine works. You are hunting for a villain in a room where there was only physiology.</w:t>
+      </w:r>
+    </w:p>
+    <w:p>
+      <w:pPr>
+        <w:pStyle w:val="RRBodyText2"/>
+      </w:pPr>
+      <w:r>
+        <w:t>Understanding this changes what the rebuild has to be. If the failure was a lapse of character, the fix would be to want it more. It was not, and wanting it more will not help. The fix is to build rules that execute when the thinking brain is unavailable, and to train the habit system in advance so that what takes over is something you chose. That is Days 15 and 16, and it is buildable.</w:t>
+      </w:r>
+    </w:p>
+    <w:p>
+      <w:pPr>
+        <w:pStyle w:val="RRSectionHead"/>
+      </w:pPr>
+      <w:r>
+        <w:t>What the Word Says To It</w:t>
+      </w:r>
+    </w:p>
+    <w:p>
+      <w:pPr>
+        <w:pStyle w:val="RRBodyText2"/>
+      </w:pPr>
+      <w:r>
+        <w:t>David does something remarkable in Psalm 42, and it is easy to miss because it is so plainly written. He talks to himself.</w:t>
+      </w:r>
+    </w:p>
+    <w:p>
+      <w:pPr>
+        <w:pStyle w:val="RRBodyText2"/>
+      </w:pPr>
+      <w:r>
+        <w:rPr>
+          <w:i/>
+        </w:rPr>
+        <w:t>“Why are you in despair, my soul?”</w:t>
+      </w:r>
+    </w:p>
+    <w:p>
+      <w:pPr>
+        <w:pStyle w:val="RRBodyText2"/>
+      </w:pPr>
+      <w:r>
+        <w:t xml:space="preserve">He does not describe his despair to us. He turns and addresses it — steps back from the feeling far enough to speak to it, and then tells it where to look: </w:t>
+      </w:r>
+      <w:r>
+        <w:rPr>
+          <w:i/>
+        </w:rPr>
+        <w:t>Hope in God.</w:t>
+      </w:r>
+      <w:r>
+        <w:t xml:space="preserve"> This is a man deliberately taking a position outside his own emotional weather in order to give it instruction.</w:t>
+      </w:r>
+    </w:p>
+    <w:p>
+      <w:pPr>
+        <w:pStyle w:val="RRBodyText2"/>
+      </w:pPr>
+      <w:r>
+        <w:t>That is exactly the manoeuvre your brain needs when the thinking system is being overwhelmed, and it is not a coincidence that a technique three thousand years old maps onto what the laboratory now recommends. Day 13 will show you the research on speaking to yourself this way, and how measurably it works. For today, notice only this: the man in the psalm is drowning, and he does not pretend otherwise, and he still turns and speaks to his own soul like someone with authority over it.</w:t>
+      </w:r>
+    </w:p>
+    <w:p>
+      <w:pPr>
+        <w:pStyle w:val="RRBodyText2"/>
+      </w:pPr>
+      <w:r>
+        <w:t>You have that authority too. You have not been using it. You have been letting the despair narrate.</w:t>
+      </w:r>
+    </w:p>
+    <w:p>
+      <w:pPr>
+        <w:pStyle w:val="RRSectionHead"/>
+      </w:pPr>
+      <w:r>
+        <w:t>The Meditation</w:t>
+      </w:r>
+    </w:p>
+    <w:p>
+      <w:pPr>
+        <w:pStyle w:val="RRMeditation"/>
+      </w:pPr>
+      <w:r>
+        <w:t>Four minutes. Sit upright, feet flat, hands resting open.</w:t>
+      </w:r>
+    </w:p>
+    <w:p>
+      <w:pPr>
+        <w:pStyle w:val="RRMeditation"/>
+      </w:pPr>
+      <w:r>
+        <w:t>Breathe in for four, out for six. Eight times today — longer than usual, because we are practising something specific.</w:t>
+      </w:r>
+    </w:p>
+    <w:p>
+      <w:pPr>
+        <w:pStyle w:val="RRMeditation"/>
+      </w:pPr>
+      <w:r>
+        <w:t>Now, out loud if you can, or inwardly if you cannot, ask yourself David’s question in your own words:</w:t>
+      </w:r>
+    </w:p>
+    <w:p>
+      <w:pPr>
+        <w:pStyle w:val="RRMeditation"/>
+      </w:pPr>
+      <w:r>
+        <w:rPr>
+          <w:i/>
+        </w:rPr>
+        <w:t>“Why are you so cast down?”</w:t>
+      </w:r>
+    </w:p>
+    <w:p>
+      <w:pPr>
+        <w:pStyle w:val="RRMeditation"/>
+      </w:pPr>
+      <w:r>
+        <w:t xml:space="preserve">Do not answer it with the number. Answer it with the honest feeling underneath — </w:t>
+      </w:r>
+      <w:r>
+        <w:rPr>
+          <w:i/>
+        </w:rPr>
+        <w:t>because I am afraid I am finished</w:t>
+      </w:r>
+      <w:r>
+        <w:t xml:space="preserve"> — and then say the second half of the verse back to that feeling, slowly:</w:t>
+      </w:r>
+    </w:p>
+    <w:p>
+      <w:pPr>
+        <w:pStyle w:val="RRMeditation"/>
+      </w:pPr>
+      <w:r>
+        <w:rPr>
+          <w:i/>
+        </w:rPr>
+        <w:t>“Hope in God. I shall still praise him.”</w:t>
+      </w:r>
+    </w:p>
+    <w:p>
+      <w:pPr>
+        <w:pStyle w:val="RRMeditation"/>
+      </w:pPr>
+      <w:r>
+        <w:t>Do that three times: the question, the honest answer, the anchor. You are not arguing yourself out of anything. You are practising standing beside the feeling rather than inside it.</w:t>
+      </w:r>
+    </w:p>
+    <w:p>
+      <w:pPr>
+        <w:pStyle w:val="RRMeditation"/>
+      </w:pPr>
+      <w:r>
+        <w:t>Finish with one long exhale.</w:t>
+      </w:r>
+    </w:p>
+    <w:p>
+      <w:pPr>
+        <w:pStyle w:val="RRSectionHead"/>
+      </w:pPr>
+      <w:r>
+        <w:t>Say It Out Loud</w:t>
+      </w:r>
+    </w:p>
+    <w:p>
+      <w:pPr>
+        <w:pStyle w:val="RRAffirmation"/>
+      </w:pPr>
+      <w:r>
+        <w:t>“My rules went offline that day, and I am rebuilding a mind that can reach them under pressure.”</w:t>
+      </w:r>
+    </w:p>
+    <w:p>
+      <w:pPr>
+        <w:pStyle w:val="RRAffirmation"/>
+      </w:pPr>
+      <w:r>
+        <w:t>“I am not the wreckage of that hour; I am the one now speaking to my own soul.”</w:t>
+      </w:r>
+    </w:p>
+    <w:p>
+      <w:pPr>
+        <w:pStyle w:val="RRAffirmation"/>
+      </w:pPr>
+      <w:r>
+        <w:t>“I do not have to feel hope to place my hope in God.”</w:t>
+      </w:r>
+    </w:p>
+    <w:p>
+      <w:pPr>
+        <w:pStyle w:val="RRSectionHead"/>
+      </w:pPr>
+      <w:r>
+        <w:t>Today’s Small Thing</w:t>
+      </w:r>
+    </w:p>
+    <w:p>
+      <w:pPr>
+        <w:pStyle w:val="RRBodyText2"/>
+      </w:pPr>
+      <w:r>
+        <w:t>Write down, in one sentence, the rule you broke. Just the rule, stated as you originally wrote it.</w:t>
+      </w:r>
+    </w:p>
+    <w:p>
+      <w:pPr>
+        <w:pStyle w:val="RRBodyText2"/>
+      </w:pPr>
+      <w:r>
+        <w:t>Underneath it, write the time of day it happened, how much sleep you had the night before, and what else was going on in your life that week.</w:t>
+      </w:r>
+    </w:p>
+    <w:p>
+      <w:pPr>
+        <w:pStyle w:val="RRBodyText2"/>
+      </w:pPr>
+      <w:r>
+        <w:t>You are not building a defence. You are gathering the conditions. The conditions are data, and from Day 15 onward we are going to use them.</w:t>
+      </w:r>
+    </w:p>
+    <w:p>
+      <w:pPr>
+        <w:pStyle w:val="RRSectionHead"/>
+      </w:pPr>
+      <w:r>
+        <w:t>Carry This</w:t>
+      </w:r>
+    </w:p>
+    <w:p>
+      <w:pPr>
+        <w:pStyle w:val="RRCarryThis"/>
+      </w:pPr>
+      <w:r>
+        <w:t>I did not lose because I lacked the will; I lost because I had no plan for the moment my will would not be available.</w:t>
+      </w:r>
+    </w:p>
+    <w:p>
+      <w:pPr>
+        <w:pStyle w:val="RRBodyText2"/>
+        <w:spacing w:after="0"/>
+      </w:pPr>
+      <w:r>
+        <w:br w:type="page"/>
+      </w:r>
+    </w:p>
+    <w:p>
+      <w:pPr>
+        <w:pStyle w:val="RRDayKicker"/>
+      </w:pPr>
+      <w:r>
+        <w:t>Day 4</w:t>
+      </w:r>
+    </w:p>
+    <w:p>
+      <w:pPr>
+        <w:pStyle w:val="RRDayTitle"/>
+      </w:pPr>
+      <w:r>
+        <w:t>Stop Replaying the Tape</w:t>
+      </w:r>
+    </w:p>
+    <w:p>
+      <w:pPr>
+        <w:pStyle w:val="RRSectionHead"/>
+      </w:pPr>
+      <w:r>
+        <w:t>The Word</w:t>
+      </w:r>
+    </w:p>
+    <w:p>
+      <w:pPr>
+        <w:pStyle w:val="RRVerse"/>
+      </w:pPr>
+      <w:r>
+        <w:t>Don’t remember the former things, and don’t consider the things of old. Behold, I will do a new thing. It springs out now. Don’t you know it? I will even make a way in the wilderness, and rivers in the desert.</w:t>
+      </w:r>
+    </w:p>
+    <w:p>
+      <w:pPr>
+        <w:pStyle w:val="RRVerseRef"/>
+      </w:pPr>
+      <w:r>
+        <w:t>Isaiah 43:18–19</w:t>
+      </w:r>
+    </w:p>
+    <w:p>
+      <w:pPr>
+        <w:pStyle w:val="RRSectionHead"/>
+      </w:pPr>
+      <w:r>
+        <w:t>Where You Are Today</w:t>
+      </w:r>
+    </w:p>
+    <w:p>
+      <w:pPr>
+        <w:pStyle w:val="RRBodyText2"/>
+      </w:pPr>
+      <w:r>
+        <w:t>It starts around two in the morning, and it always starts in the same place.</w:t>
+      </w:r>
+    </w:p>
+    <w:p>
+      <w:pPr>
+        <w:pStyle w:val="RRBodyText2"/>
+      </w:pPr>
+      <w:r>
+        <w:t>You are back at the screen. The level is approaching. And this time — in the version your mind insists on running, again and again, in high definition — you close. You feel the relief of it, actual physical relief in your chest, for about a second and a half. Then you remember, and the relief curdles, and you are lying in the dark with your heart going.</w:t>
+      </w:r>
+    </w:p>
+    <w:p>
+      <w:pPr>
+        <w:pStyle w:val="RRBodyText2"/>
+      </w:pPr>
+      <w:r>
+        <w:t xml:space="preserve">So you run it again. Slightly differently. What if you had sized smaller from the start. What if you had never taken it. What if you had stepped away from the desk at eleven. Each version is a small, exquisite torture, and you cannot stop, because every pass feels like it is </w:t>
+      </w:r>
+      <w:r>
+        <w:rPr>
+          <w:i/>
+        </w:rPr>
+        <w:t>nearly</w:t>
+      </w:r>
+      <w:r>
+        <w:t xml:space="preserve"> getting somewhere.</w:t>
+      </w:r>
+    </w:p>
+    <w:p>
+      <w:pPr>
+        <w:pStyle w:val="RRBodyText2"/>
+      </w:pPr>
+      <w:r>
+        <w:t>It is not getting anywhere. That is today’s subject.</w:t>
+      </w:r>
+    </w:p>
+    <w:p>
+      <w:pPr>
+        <w:pStyle w:val="RRSectionHead"/>
+      </w:pPr>
+      <w:r>
+        <w:t>What Is Happening In Your Brain</w:t>
+      </w:r>
+    </w:p>
+    <w:p>
+      <w:pPr>
+        <w:pStyle w:val="RRBodyText2"/>
+      </w:pPr>
+      <w:r>
+        <w:t>There is a crucial distinction here, and almost everyone gets it wrong, including intelligent people who pride themselves on self-examination.</w:t>
+      </w:r>
+    </w:p>
+    <w:p>
+      <w:pPr>
+        <w:pStyle w:val="RRBodyText2"/>
+      </w:pPr>
+      <w:r>
+        <w:rPr>
+          <w:b/>
+        </w:rPr>
+        <w:t>Reflection</w:t>
+      </w:r>
+      <w:r>
+        <w:t xml:space="preserve"> is thinking about what happened in order to extract something usable. It is time-bounded, it asks </w:t>
+      </w:r>
+      <w:r>
+        <w:rPr>
+          <w:i/>
+        </w:rPr>
+        <w:t>what</w:t>
+      </w:r>
+      <w:r>
+        <w:t xml:space="preserve"> questions, and it ends with a conclusion you could write down. </w:t>
+      </w:r>
+      <w:r>
+        <w:rPr>
+          <w:b/>
+        </w:rPr>
+        <w:t>Rumination</w:t>
+      </w:r>
+      <w:r>
+        <w:t xml:space="preserve"> is thinking about what happened in a repetitive, unbounded loop. It asks </w:t>
+      </w:r>
+      <w:r>
+        <w:rPr>
+          <w:i/>
+        </w:rPr>
+        <w:t>why</w:t>
+      </w:r>
+      <w:r>
+        <w:t xml:space="preserve"> questions — </w:t>
+      </w:r>
+      <w:r>
+        <w:rPr>
+          <w:i/>
+        </w:rPr>
+        <w:t>why me, why did I, why am I like this</w:t>
+      </w:r>
+      <w:r>
+        <w:t xml:space="preserve"> — and it never ends with anything, because it is not trying to.</w:t>
+      </w:r>
+    </w:p>
+    <w:p>
+      <w:pPr>
+        <w:pStyle w:val="RRBodyText2"/>
+      </w:pPr>
+      <w:r>
+        <w:t xml:space="preserve">Susan Nolen-Hoeksema spent a career mapping this. Her finding, replicated many times: rumination does not solve problems. It makes problem-solving measurably </w:t>
+      </w:r>
+      <w:r>
+        <w:rPr>
+          <w:i/>
+        </w:rPr>
+        <w:t>worse</w:t>
+      </w:r>
+      <w:r>
+        <w:t>. People induced to ruminate before a task generate poorer solutions and less confidence in them than people who were distracted first. Rumination also strongly predicts the onset and duration of depression, and it predicts increased alcohol use as an escape from it.</w:t>
+      </w:r>
+    </w:p>
+    <w:p>
+      <w:pPr>
+        <w:pStyle w:val="RRBodyText2"/>
+      </w:pPr>
+      <w:r>
+        <w:t xml:space="preserve">The cruelty of the mechanism is that rumination </w:t>
+      </w:r>
+      <w:r>
+        <w:rPr>
+          <w:i/>
+        </w:rPr>
+        <w:t>feels</w:t>
+      </w:r>
+      <w:r>
+        <w:t xml:space="preserve"> like effort. It has the texture of work. Your brain is running scenarios, deploying real intelligence, taking the matter seriously — every subjective marker of productive thought is present. But the loop has no exit condition. You cannot solve a problem whose only solution would be a different past.</w:t>
+      </w:r>
+    </w:p>
+    <w:p>
+      <w:pPr>
+        <w:pStyle w:val="RRBodyText2"/>
+      </w:pPr>
+      <w:r>
+        <w:t xml:space="preserve">There is a second reason it grips you specifically. What you are running is called </w:t>
+      </w:r>
+      <w:r>
+        <w:rPr>
+          <w:b/>
+        </w:rPr>
+        <w:t>counterfactual thinking</w:t>
+      </w:r>
+      <w:r>
+        <w:t xml:space="preserve"> — the </w:t>
+      </w:r>
+      <w:r>
+        <w:rPr>
+          <w:i/>
+        </w:rPr>
+        <w:t>if only</w:t>
+      </w:r>
+      <w:r>
+        <w:t xml:space="preserve"> simulation — and it is fuel for regret. Counterfactuals that are easy to imagine produce far sharper pain than counterfactuals that are hard to imagine, which is why near-misses hurt worse than distant ones. Your alternative was one click away. It is trivially easy to picture. So your mind pictures it forty times a night, and each rehearsal cuts the groove deeper.</w:t>
+      </w:r>
+    </w:p>
+    <w:p>
+      <w:pPr>
+        <w:pStyle w:val="RRBodyText2"/>
+      </w:pPr>
+      <w:r>
+        <w:t>So how do you stop something that will not stop?</w:t>
+      </w:r>
+    </w:p>
+    <w:p>
+      <w:pPr>
+        <w:pStyle w:val="RRBodyText2"/>
+      </w:pPr>
+      <w:r>
+        <w:t>Not by suppression — Day 9 will show you why that backfires. The evidence points somewhere more practical: give the loop what it is asking for, in a bounded form, on paper, at a time you choose. Rumination is partly a memory system insisting the matter is unfinished. Finish it deliberately, in writing, and it loses much of its claim on your nights. That is Day 8, and it is why Day 8 exists.</w:t>
+      </w:r>
+    </w:p>
+    <w:p>
+      <w:pPr>
+        <w:pStyle w:val="RRBodyText2"/>
+      </w:pPr>
+      <w:r>
+        <w:t>Today’s job is smaller. Today you only have to notice the loop and name it as a loop. You cannot interrupt a process you have not identified.</w:t>
+      </w:r>
+    </w:p>
+    <w:p>
+      <w:pPr>
+        <w:pStyle w:val="RRSectionHead"/>
+      </w:pPr>
+      <w:r>
+        <w:t>What the Word Says To It</w:t>
+      </w:r>
+    </w:p>
+    <w:p>
+      <w:pPr>
+        <w:pStyle w:val="RRBodyText2"/>
+      </w:pPr>
+      <w:r>
+        <w:t>Read the command carefully, because it is stranger than it first appears.</w:t>
+      </w:r>
+    </w:p>
+    <w:p>
+      <w:pPr>
+        <w:pStyle w:val="RRBodyText2"/>
+      </w:pPr>
+      <w:r>
+        <w:rPr>
+          <w:i/>
+        </w:rPr>
+        <w:t>“Don’t remember the former things.”</w:t>
+      </w:r>
+    </w:p>
+    <w:p>
+      <w:pPr>
+        <w:pStyle w:val="RRBodyText2"/>
+      </w:pPr>
+      <w:r>
+        <w:t xml:space="preserve">This is said by God to a people whose entire spiritual practice was built on remembering — on rehearsing the Exodus, on stacking stones so their children would ask what happened here. Remembrance is </w:t>
+      </w:r>
+      <w:r>
+        <w:rPr>
+          <w:i/>
+        </w:rPr>
+        <w:t>commanded</w:t>
+      </w:r>
+      <w:r>
+        <w:t xml:space="preserve"> all through the Scriptures. And now, through Isaiah, the instruction is: not this. Not now. Stop looking backwards.</w:t>
+      </w:r>
+    </w:p>
+    <w:p>
+      <w:pPr>
+        <w:pStyle w:val="RRBodyText2"/>
+      </w:pPr>
+      <w:r>
+        <w:t xml:space="preserve">Which tells you that the prohibition is not against memory. It is against a particular </w:t>
+      </w:r>
+      <w:r>
+        <w:rPr>
+          <w:i/>
+        </w:rPr>
+        <w:t>use</w:t>
+      </w:r>
+      <w:r>
+        <w:t xml:space="preserve"> of memory — the kind that keeps a person’s face turned to a past they cannot change while something new is starting behind them.</w:t>
+      </w:r>
+    </w:p>
+    <w:p>
+      <w:pPr>
+        <w:pStyle w:val="RRBodyText2"/>
+      </w:pPr>
+      <w:r>
+        <w:t xml:space="preserve">And notice the tense in what follows. Not </w:t>
+      </w:r>
+      <w:r>
+        <w:rPr>
+          <w:i/>
+        </w:rPr>
+        <w:t>I will do a new thing eventually</w:t>
+      </w:r>
+      <w:r>
+        <w:t xml:space="preserve">. </w:t>
+      </w:r>
+      <w:r>
+        <w:rPr>
+          <w:b/>
+        </w:rPr>
+        <w:t>“It springs out now. Don’t you know it?”</w:t>
+      </w:r>
+      <w:r>
+        <w:t xml:space="preserve"> There is almost impatience in it. The new thing is already breaking ground, and the reason it goes unnoticed is that the person it is happening to is facing the wrong way.</w:t>
+      </w:r>
+    </w:p>
+    <w:p>
+      <w:pPr>
+        <w:pStyle w:val="RRBodyText2"/>
+      </w:pPr>
+      <w:r>
+        <w:t xml:space="preserve">The wilderness in that verse is not removed. God does not say </w:t>
+      </w:r>
+      <w:r>
+        <w:rPr>
+          <w:i/>
+        </w:rPr>
+        <w:t>I will take you out of the desert</w:t>
+      </w:r>
+      <w:r>
+        <w:t xml:space="preserve">. He says He will make a way </w:t>
+      </w:r>
+      <w:r>
+        <w:rPr>
+          <w:b/>
+        </w:rPr>
+        <w:t>in</w:t>
+      </w:r>
+      <w:r>
+        <w:t xml:space="preserve"> it, and rivers </w:t>
+      </w:r>
+      <w:r>
+        <w:rPr>
+          <w:b/>
+        </w:rPr>
+        <w:t>in</w:t>
+      </w:r>
+      <w:r>
+        <w:t xml:space="preserve"> it. You are not being asked to pretend the desert isn’t there. You are being asked to stop staring at the road behind you long enough to see what is being cut through the one ahead.</w:t>
+      </w:r>
+    </w:p>
+    <w:p>
+      <w:pPr>
+        <w:pStyle w:val="RRSectionHead"/>
+      </w:pPr>
+      <w:r>
+        <w:t>The Meditation</w:t>
+      </w:r>
+    </w:p>
+    <w:p>
+      <w:pPr>
+        <w:pStyle w:val="RRMeditation"/>
+      </w:pPr>
+      <w:r>
+        <w:t>Four minutes. Sit still. Both feet on the floor.</w:t>
+      </w:r>
+    </w:p>
+    <w:p>
+      <w:pPr>
+        <w:pStyle w:val="RRMeditation"/>
+      </w:pPr>
+      <w:r>
+        <w:t>Breathe in for four, out for six, six times.</w:t>
+      </w:r>
+    </w:p>
+    <w:p>
+      <w:pPr>
+        <w:pStyle w:val="RRMeditation"/>
+      </w:pPr>
+      <w:r>
+        <w:t>Now let the tape start. Do not fight it — let one replay come. And the moment you recognise it, say quietly to yourself, in a flat and unbothered voice:</w:t>
+      </w:r>
+    </w:p>
+    <w:p>
+      <w:pPr>
+        <w:pStyle w:val="RRMeditation"/>
+      </w:pPr>
+      <w:r>
+        <w:rPr>
+          <w:i/>
+        </w:rPr>
+        <w:t>“That is the loop. Not now.”</w:t>
+      </w:r>
+    </w:p>
+    <w:p>
+      <w:pPr>
+        <w:pStyle w:val="RRMeditation"/>
+      </w:pPr>
+      <w:r>
+        <w:t xml:space="preserve">Then return to the breath. The tape will start again within about ten seconds. Say it again. </w:t>
+      </w:r>
+      <w:r>
+        <w:rPr>
+          <w:i/>
+        </w:rPr>
+        <w:t>That is the loop. Not now.</w:t>
+      </w:r>
+    </w:p>
+    <w:p>
+      <w:pPr>
+        <w:pStyle w:val="RRMeditation"/>
+      </w:pPr>
+      <w:r>
+        <w:t>You may do this fifteen times in four minutes. That is not failure — that is fifteen repetitions of exactly the skill we are building, which is the ability to catch the loop early instead of surfacing from it forty minutes later.</w:t>
+      </w:r>
+    </w:p>
+    <w:p>
+      <w:pPr>
+        <w:pStyle w:val="RRMeditation"/>
+      </w:pPr>
+      <w:r>
+        <w:t xml:space="preserve">Finish with the verse: </w:t>
+      </w:r>
+      <w:r>
+        <w:rPr>
+          <w:i/>
+        </w:rPr>
+        <w:t>“It springs out now.”</w:t>
+      </w:r>
+      <w:r>
+        <w:t xml:space="preserve"> One long exhale.</w:t>
+      </w:r>
+    </w:p>
+    <w:p>
+      <w:pPr>
+        <w:pStyle w:val="RRSectionHead"/>
+      </w:pPr>
+      <w:r>
+        <w:t>Say It Out Loud</w:t>
+      </w:r>
+    </w:p>
+    <w:p>
+      <w:pPr>
+        <w:pStyle w:val="RRAffirmation"/>
+      </w:pPr>
+      <w:r>
+        <w:t>“I can think about what happened without living inside it.”</w:t>
+      </w:r>
+    </w:p>
+    <w:p>
+      <w:pPr>
+        <w:pStyle w:val="RRAffirmation"/>
+      </w:pPr>
+      <w:r>
+        <w:t>“Replaying it is not the same as learning from it, and I am done confusing the two.”</w:t>
+      </w:r>
+    </w:p>
+    <w:p>
+      <w:pPr>
+        <w:pStyle w:val="RRAffirmation"/>
+      </w:pPr>
+      <w:r>
+        <w:t>“God is making a way in this wilderness, and I intend to be facing forward when I see it.”</w:t>
+      </w:r>
+    </w:p>
+    <w:p>
+      <w:pPr>
+        <w:pStyle w:val="RRSectionHead"/>
+      </w:pPr>
+      <w:r>
+        <w:t>Today’s Small Thing</w:t>
+      </w:r>
+    </w:p>
+    <w:p>
+      <w:pPr>
+        <w:pStyle w:val="RRBodyText2"/>
+      </w:pPr>
+      <w:r>
+        <w:t>Give the loop an appointment.</w:t>
+      </w:r>
+    </w:p>
+    <w:p>
+      <w:pPr>
+        <w:pStyle w:val="RRBodyText2"/>
+      </w:pPr>
+      <w:r>
+        <w:t xml:space="preserve">Choose a fifteen-minute window today — a real time, written down, ideally late afternoon rather than late night. When the tape starts outside that window, you say </w:t>
+      </w:r>
+      <w:r>
+        <w:rPr>
+          <w:i/>
+        </w:rPr>
+        <w:t>not now, we have a slot</w:t>
+      </w:r>
+      <w:r>
+        <w:t>. When the window arrives, you sit with a notebook and let it run, and you write.</w:t>
+      </w:r>
+    </w:p>
+    <w:p>
+      <w:pPr>
+        <w:pStyle w:val="RRBodyText2"/>
+      </w:pPr>
+      <w:r>
+        <w:t>If the mind wants to review, it may review. On a schedule. In daylight. With a pen. Nowhere else.</w:t>
+      </w:r>
+    </w:p>
+    <w:p>
+      <w:pPr>
+        <w:pStyle w:val="RRSectionHead"/>
+      </w:pPr>
+      <w:r>
+        <w:t>Carry This</w:t>
+      </w:r>
+    </w:p>
+    <w:p>
+      <w:pPr>
+        <w:pStyle w:val="RRCarryThis"/>
+      </w:pPr>
+      <w:r>
+        <w:t>Turning it over one more time has never once produced a different ending, and I have tested that a hundred times.</w:t>
+      </w:r>
+    </w:p>
+    <w:p>
+      <w:pPr>
+        <w:pStyle w:val="RRBodyText2"/>
+        <w:spacing w:after="0"/>
+      </w:pPr>
+      <w:r>
+        <w:br w:type="page"/>
+      </w:r>
+    </w:p>
+    <w:p>
+      <w:pPr>
+        <w:pStyle w:val="RRDayKicker"/>
+      </w:pPr>
+      <w:r>
+        <w:t>Day 5</w:t>
+      </w:r>
+    </w:p>
+    <w:p>
+      <w:pPr>
+        <w:pStyle w:val="RRDayTitle"/>
+      </w:pPr>
+      <w:r>
+        <w:t>Name It to Tame It</w:t>
+      </w:r>
+    </w:p>
+    <w:p>
+      <w:pPr>
+        <w:pStyle w:val="RRSectionHead"/>
+      </w:pPr>
+      <w:r>
+        <w:t>The Word</w:t>
+      </w:r>
+    </w:p>
+    <w:p>
+      <w:pPr>
+        <w:pStyle w:val="RRVerse"/>
+      </w:pPr>
+      <w:r>
+        <w:t>Trust in him at all times, you people. Pour out your heart before him. God is a refuge for us.</w:t>
+      </w:r>
+    </w:p>
+    <w:p>
+      <w:pPr>
+        <w:pStyle w:val="RRVerseRef"/>
+      </w:pPr>
+      <w:r>
+        <w:t>Psalm 62:8</w:t>
+      </w:r>
+    </w:p>
+    <w:p>
+      <w:pPr>
+        <w:pStyle w:val="RRSectionHead"/>
+      </w:pPr>
+      <w:r>
+        <w:t>Where You Are Today</w:t>
+      </w:r>
+    </w:p>
+    <w:p>
+      <w:pPr>
+        <w:pStyle w:val="RRBodyText2"/>
+      </w:pPr>
+      <w:r>
+        <w:t>Someone asked you yesterday how you were doing.</w:t>
+      </w:r>
+    </w:p>
+    <w:p>
+      <w:pPr>
+        <w:pStyle w:val="RRBodyText2"/>
+      </w:pPr>
+      <w:r>
+        <w:t xml:space="preserve">And you heard yourself say it — </w:t>
+      </w:r>
+      <w:r>
+        <w:rPr>
+          <w:i/>
+        </w:rPr>
+        <w:t>yeah, not my best month, bit of a rough patch</w:t>
+      </w:r>
+      <w:r>
+        <w:t xml:space="preserve"> — in a voice so light and so practised that even you almost believed it. You watched their face relax. You changed the subject smoothly, because you are good at this, and then you carried the whole undischarged weight of it into the next room and the next hour and into bed with you.</w:t>
+      </w:r>
+    </w:p>
+    <w:p>
+      <w:pPr>
+        <w:pStyle w:val="RRBodyText2"/>
+      </w:pPr>
+      <w:r>
+        <w:t>There is a specific loneliness in being asked and answering falsely. It is worse than not being asked. And the strangest part is that you did not do it to protect them. You did it because putting the real thing into words felt dangerous — as though naming it plainly would make it larger, or make it real in a way it is not yet.</w:t>
+      </w:r>
+    </w:p>
+    <w:p>
+      <w:pPr>
+        <w:pStyle w:val="RRBodyText2"/>
+      </w:pPr>
+      <w:r>
+        <w:t>The opposite is true, and it is one of the better-supported findings in the whole of affective neuroscience.</w:t>
+      </w:r>
+    </w:p>
+    <w:p>
+      <w:pPr>
+        <w:pStyle w:val="RRSectionHead"/>
+      </w:pPr>
+      <w:r>
+        <w:t>What Is Happening In Your Brain</w:t>
+      </w:r>
+    </w:p>
+    <w:p>
+      <w:pPr>
+        <w:pStyle w:val="RRBodyText2"/>
+      </w:pPr>
+      <w:r>
+        <w:t xml:space="preserve">Putting a feeling into words reduces the intensity of the feeling. Researchers call it </w:t>
+      </w:r>
+      <w:r>
+        <w:rPr>
+          <w:b/>
+        </w:rPr>
+        <w:t>affect labelling</w:t>
+      </w:r>
+      <w:r>
+        <w:t>, and you can watch it happen inside the skull.</w:t>
+      </w:r>
+    </w:p>
+    <w:p>
+      <w:pPr>
+        <w:pStyle w:val="RRBodyText2"/>
+      </w:pPr>
+      <w:r>
+        <w:t xml:space="preserve">In a well-known set of studies led by Matthew Lieberman, people were shown images of distressed faces while their brains were scanned. When they simply looked, the amygdala — the threat-detection structure we met on Day 1 — responded strongly. When they were asked to choose a </w:t>
+      </w:r>
+      <w:r>
+        <w:rPr>
+          <w:i/>
+        </w:rPr>
+        <w:t>word</w:t>
+      </w:r>
+      <w:r>
+        <w:t xml:space="preserve"> for the emotion they were seeing, something specific happened: </w:t>
+      </w:r>
+      <w:r>
+        <w:rPr>
+          <w:b/>
+        </w:rPr>
+        <w:t>amygdala activity went down</w:t>
+      </w:r>
+      <w:r>
+        <w:t>, and activity rose in a region of the prefrontal cortex associated with verbal processing and inhibition. The naming was doing the damping.</w:t>
+      </w:r>
+    </w:p>
+    <w:p>
+      <w:pPr>
+        <w:pStyle w:val="RRBodyText2"/>
+      </w:pPr>
+      <w:r>
+        <w:t xml:space="preserve">Notice what this is not. It is not venting. It is not the intensity of the expression that helps — shouting about it produces no such effect, and Day 8 will show you that unstructured emotional discharge is one of the few things in this literature that reliably fails. What helps is the </w:t>
+      </w:r>
+      <w:r>
+        <w:rPr>
+          <w:b/>
+        </w:rPr>
+        <w:t>precision of the label</w:t>
+      </w:r>
+      <w:r>
+        <w:t xml:space="preserve">. Vague words do vague work. There is good evidence that people who habitually distinguish between fine-grained emotional states — who can tell </w:t>
+      </w:r>
+      <w:r>
+        <w:rPr>
+          <w:i/>
+        </w:rPr>
+        <w:t>ashamed</w:t>
+      </w:r>
+      <w:r>
+        <w:t xml:space="preserve"> from </w:t>
+      </w:r>
+      <w:r>
+        <w:rPr>
+          <w:i/>
+        </w:rPr>
+        <w:t>humiliated</w:t>
+      </w:r>
+      <w:r>
+        <w:t xml:space="preserve"> from </w:t>
+      </w:r>
+      <w:r>
+        <w:rPr>
+          <w:i/>
+        </w:rPr>
+        <w:t>disappointed</w:t>
+      </w:r>
+      <w:r>
+        <w:t xml:space="preserve"> — regulate themselves better under stress and drink less to cope.</w:t>
+      </w:r>
+    </w:p>
+    <w:p>
+      <w:pPr>
+        <w:pStyle w:val="RRBodyText2"/>
+      </w:pPr>
+      <w:r>
+        <w:t xml:space="preserve">Which gives you a concrete problem to solve. Right now you have one word for what you feel, and the word is </w:t>
+      </w:r>
+      <w:r>
+        <w:rPr>
+          <w:i/>
+        </w:rPr>
+        <w:t>bad</w:t>
+      </w:r>
+      <w:r>
+        <w:t>. Under that word are at least four separate things, and they need different responses. Fear about the future is not the same as shame about being seen. Grief for the money is not the same as grief for the self-image. Anger at yourself is not the same as anger at the market. You have been carrying them in a single unlabelled sack, and a single unlabelled sack cannot be put down, because you cannot put down a thing you have not named.</w:t>
+      </w:r>
+    </w:p>
+    <w:p>
+      <w:pPr>
+        <w:pStyle w:val="RRBodyText2"/>
+      </w:pPr>
+      <w:r>
+        <w:t xml:space="preserve">There is one more finding worth having. The effect works even when people do not believe it is working, and even when it feels </w:t>
+      </w:r>
+      <w:r>
+        <w:rPr>
+          <w:i/>
+        </w:rPr>
+        <w:t>worse</w:t>
+      </w:r>
+      <w:r>
+        <w:t xml:space="preserve"> in the moment. Naming often stings on the way in. That sting is not a sign you have made a mistake. It is the sound of a vague dread becoming a specific, and therefore finite, thing.</w:t>
+      </w:r>
+    </w:p>
+    <w:p>
+      <w:pPr>
+        <w:pStyle w:val="RRSectionHead"/>
+      </w:pPr>
+      <w:r>
+        <w:t>What the Word Says To It</w:t>
+      </w:r>
+    </w:p>
+    <w:p>
+      <w:pPr>
+        <w:pStyle w:val="RRBodyText2"/>
+      </w:pPr>
+      <w:r>
+        <w:rPr>
+          <w:i/>
+        </w:rPr>
+        <w:t>“Pour out your heart before him.”</w:t>
+      </w:r>
+    </w:p>
+    <w:p>
+      <w:pPr>
+        <w:pStyle w:val="RRBodyText2"/>
+      </w:pPr>
+      <w:r>
+        <w:t>The Hebrew image is of emptying a vessel — tipping it up and letting the contents run out. Not summarising the contents. Not editing them into something more presentable first. Pouring.</w:t>
+      </w:r>
+    </w:p>
+    <w:p>
+      <w:pPr>
+        <w:pStyle w:val="RRBodyText2"/>
+      </w:pPr>
+      <w:r>
+        <w:t>The Psalms are the least polite book in the Bible, and that is precisely their genius. Their authors accuse God of forgetting them, of sleeping, of hiding. They describe their bones wasting and their eyes failing. Psalm 88 ends in unrelieved darkness with no resolution at all — a poem of despair that the people of God have kept in their songbook for millennia rather than tidying it away. Whoever assembled this collection believed that God can be told the truth, including the ugly parts, including the parts that sound like blasphemy when written down.</w:t>
+      </w:r>
+    </w:p>
+    <w:p>
+      <w:pPr>
+        <w:pStyle w:val="RRBodyText2"/>
+      </w:pPr>
+      <w:r>
+        <w:t xml:space="preserve">So the invitation is not </w:t>
+      </w:r>
+      <w:r>
+        <w:rPr>
+          <w:i/>
+        </w:rPr>
+        <w:t>tell God the acceptable version</w:t>
+      </w:r>
+      <w:r>
+        <w:t xml:space="preserve">. Nobody in Scripture does that. And notice what the verse offers in exchange: not a solution, but a </w:t>
+      </w:r>
+      <w:r>
+        <w:rPr>
+          <w:b/>
+        </w:rPr>
+        <w:t>refuge</w:t>
+      </w:r>
+      <w:r>
+        <w:t>. A place to be while it is still bad.</w:t>
+      </w:r>
+    </w:p>
+    <w:p>
+      <w:pPr>
+        <w:pStyle w:val="RRBodyText2"/>
+      </w:pPr>
+      <w:r>
+        <w:t>You gave a false answer yesterday because you had nowhere safe to give a true one. Here is somewhere.</w:t>
+      </w:r>
+    </w:p>
+    <w:p>
+      <w:pPr>
+        <w:pStyle w:val="RRSectionHead"/>
+      </w:pPr>
+      <w:r>
+        <w:t>The Meditation</w:t>
+      </w:r>
+    </w:p>
+    <w:p>
+      <w:pPr>
+        <w:pStyle w:val="RRMeditation"/>
+      </w:pPr>
+      <w:r>
+        <w:t>Five minutes today. Sit down where you will not be interrupted.</w:t>
+      </w:r>
+    </w:p>
+    <w:p>
+      <w:pPr>
+        <w:pStyle w:val="RRMeditation"/>
+      </w:pPr>
+      <w:r>
+        <w:t>Breathe in for four, out for six, six times.</w:t>
+      </w:r>
+    </w:p>
+    <w:p>
+      <w:pPr>
+        <w:pStyle w:val="RRMeditation"/>
+      </w:pPr>
+      <w:r>
+        <w:t>Now do the naming. Slowly, aloud if you can, complete this sentence four separate times, with a different word each time:</w:t>
+      </w:r>
+    </w:p>
+    <w:p>
+      <w:pPr>
+        <w:pStyle w:val="RRMeditation"/>
+      </w:pPr>
+      <w:r>
+        <w:rPr>
+          <w:i/>
+        </w:rPr>
+        <w:t>“What I actually feel is ______.”</w:t>
+      </w:r>
+    </w:p>
+    <w:p>
+      <w:pPr>
+        <w:pStyle w:val="RRMeditation"/>
+      </w:pPr>
+      <w:r>
+        <w:t xml:space="preserve">Push past the first word. The first word is usually </w:t>
+      </w:r>
+      <w:r>
+        <w:rPr>
+          <w:i/>
+        </w:rPr>
+        <w:t>bad</w:t>
+      </w:r>
+      <w:r>
+        <w:t xml:space="preserve"> or </w:t>
+      </w:r>
+      <w:r>
+        <w:rPr>
+          <w:i/>
+        </w:rPr>
+        <w:t>stressed</w:t>
+      </w:r>
+      <w:r>
+        <w:t xml:space="preserve"> and it is almost always a lid on something more specific. Keep going until you find one that makes your chest tighten slightly when you say it. That tightening is how you know you have located the real one.</w:t>
+      </w:r>
+    </w:p>
+    <w:p>
+      <w:pPr>
+        <w:pStyle w:val="RRMeditation"/>
+      </w:pPr>
+      <w:r>
+        <w:t xml:space="preserve">Then take the sharpest of the four and say it to God, plainly, in your own words. Not a prayer with the grammar of a prayer. Just the thing itself: </w:t>
+      </w:r>
+      <w:r>
+        <w:rPr>
+          <w:i/>
+        </w:rPr>
+        <w:t>I am ashamed. I cannot look at myself.</w:t>
+      </w:r>
+    </w:p>
+    <w:p>
+      <w:pPr>
+        <w:pStyle w:val="RRMeditation"/>
+      </w:pPr>
+      <w:r>
+        <w:t>Then be quiet for thirty seconds. Do not fill the silence.</w:t>
+      </w:r>
+    </w:p>
+    <w:p>
+      <w:pPr>
+        <w:pStyle w:val="RRMeditation"/>
+      </w:pPr>
+      <w:r>
+        <w:t xml:space="preserve">Close: </w:t>
+      </w:r>
+      <w:r>
+        <w:rPr>
+          <w:i/>
+        </w:rPr>
+        <w:t>“God is a refuge for us.”</w:t>
+      </w:r>
+      <w:r>
+        <w:t xml:space="preserve"> One long exhale.</w:t>
+      </w:r>
+    </w:p>
+    <w:p>
+      <w:pPr>
+        <w:pStyle w:val="RRSectionHead"/>
+      </w:pPr>
+      <w:r>
+        <w:t>Say It Out Loud</w:t>
+      </w:r>
+    </w:p>
+    <w:p>
+      <w:pPr>
+        <w:pStyle w:val="RRAffirmation"/>
+      </w:pPr>
+      <w:r>
+        <w:t>“I can name what I feel, and naming it makes it smaller, not larger.”</w:t>
+      </w:r>
+    </w:p>
+    <w:p>
+      <w:pPr>
+        <w:pStyle w:val="RRAffirmation"/>
+      </w:pPr>
+      <w:r>
+        <w:t>“I do not have to edit myself before I bring myself to God.”</w:t>
+      </w:r>
+    </w:p>
+    <w:p>
+      <w:pPr>
+        <w:pStyle w:val="RRAffirmation"/>
+      </w:pPr>
+      <w:r>
+        <w:t>“What I am carrying has a name, a size, and an end.”</w:t>
+      </w:r>
+    </w:p>
+    <w:p>
+      <w:pPr>
+        <w:pStyle w:val="RRSectionHead"/>
+      </w:pPr>
+      <w:r>
+        <w:t>Today’s Small Thing</w:t>
+      </w:r>
+    </w:p>
+    <w:p>
+      <w:pPr>
+        <w:pStyle w:val="RRBodyText2"/>
+      </w:pPr>
+      <w:r>
+        <w:t>Go back to whoever asked you yesterday — or find one person who is safe — and correct the record.</w:t>
+      </w:r>
+    </w:p>
+    <w:p>
+      <w:pPr>
+        <w:pStyle w:val="RRBodyText2"/>
+      </w:pPr>
+      <w:r>
+        <w:t xml:space="preserve">One sentence. </w:t>
+      </w:r>
+      <w:r>
+        <w:rPr>
+          <w:i/>
+        </w:rPr>
+        <w:t>When you asked how I was, I gave you the easy answer. The truth is I am struggling.</w:t>
+      </w:r>
+      <w:r>
+        <w:t xml:space="preserve"> You do not have to explain further, and if they ask, you may say you would rather not go into it yet.</w:t>
+      </w:r>
+    </w:p>
+    <w:p>
+      <w:pPr>
+        <w:pStyle w:val="RRBodyText2"/>
+      </w:pPr>
+      <w:r>
+        <w:t>You are not asking them to fix anything. You are practising the difference between a private life and a false one.</w:t>
+      </w:r>
+    </w:p>
+    <w:p>
+      <w:pPr>
+        <w:pStyle w:val="RRSectionHead"/>
+      </w:pPr>
+      <w:r>
+        <w:t>Carry This</w:t>
+      </w:r>
+    </w:p>
+    <w:p>
+      <w:pPr>
+        <w:pStyle w:val="RRCarryThis"/>
+      </w:pPr>
+      <w:r>
+        <w:t>The thing I refuse to name is the thing that grows in the dark; the thing I name out loud is the thing I can finally see the edges of.</w:t>
+      </w:r>
+    </w:p>
+    <w:p>
+      <w:pPr>
+        <w:pStyle w:val="RRBodyText2"/>
+        <w:spacing w:after="0"/>
+      </w:pPr>
+      <w:r>
+        <w:br w:type="page"/>
+      </w:r>
+    </w:p>
+    <w:p>
+      <w:pPr>
+        <w:pStyle w:val="RRDayKicker"/>
+      </w:pPr>
+      <w:r>
+        <w:t>Day 6</w:t>
+      </w:r>
+    </w:p>
+    <w:p>
+      <w:pPr>
+        <w:pStyle w:val="RRDayTitle"/>
+      </w:pPr>
+      <w:r>
+        <w:t>You Are Not the Loss</w:t>
+      </w:r>
+    </w:p>
+    <w:p>
+      <w:pPr>
+        <w:pStyle w:val="RRSectionHead"/>
+      </w:pPr>
+      <w:r>
+        <w:t>The Word</w:t>
+      </w:r>
+    </w:p>
+    <w:p>
+      <w:pPr>
+        <w:pStyle w:val="RRVerse"/>
+      </w:pPr>
+      <w:r>
+        <w:t>There is therefore now no condemnation to those who are in Christ Jesus.</w:t>
+      </w:r>
+    </w:p>
+    <w:p>
+      <w:pPr>
+        <w:pStyle w:val="RRVerseRef"/>
+      </w:pPr>
+      <w:r>
+        <w:t>Romans 8:1</w:t>
+      </w:r>
+    </w:p>
+    <w:p>
+      <w:pPr>
+        <w:pStyle w:val="RRSectionHead"/>
+      </w:pPr>
+      <w:r>
+        <w:t>Where You Are Today</w:t>
+      </w:r>
+    </w:p>
+    <w:p>
+      <w:pPr>
+        <w:pStyle w:val="RRBodyText2"/>
+      </w:pPr>
+      <w:r>
+        <w:t>Listen to the sentence you said to yourself in the shower this morning.</w:t>
+      </w:r>
+    </w:p>
+    <w:p>
+      <w:pPr>
+        <w:pStyle w:val="RRBodyText2"/>
+      </w:pPr>
+      <w:r>
+        <w:rPr>
+          <w:i/>
+        </w:rPr>
+        <w:t>You absolute idiot.</w:t>
+      </w:r>
+    </w:p>
+    <w:p>
+      <w:pPr>
+        <w:pStyle w:val="RRBodyText2"/>
+      </w:pPr>
+      <w:r>
+        <w:t xml:space="preserve">Or some version of it — </w:t>
+      </w:r>
+      <w:r>
+        <w:rPr>
+          <w:i/>
+        </w:rPr>
+        <w:t>pathetic</w:t>
+      </w:r>
+      <w:r>
+        <w:t xml:space="preserve">, </w:t>
+      </w:r>
+      <w:r>
+        <w:rPr>
+          <w:i/>
+        </w:rPr>
+        <w:t>amateur</w:t>
+      </w:r>
+      <w:r>
+        <w:t xml:space="preserve">, </w:t>
+      </w:r>
+      <w:r>
+        <w:rPr>
+          <w:i/>
+        </w:rPr>
+        <w:t>you deserve this</w:t>
+      </w:r>
+      <w:r>
+        <w:t xml:space="preserve">, </w:t>
+      </w:r>
+      <w:r>
+        <w:rPr>
+          <w:i/>
+        </w:rPr>
+        <w:t>you have always been this and you finally got found out</w:t>
+      </w:r>
+      <w:r>
+        <w:t>. Said flatly, without drama, as a statement of settled fact. You have probably said something in that family a hundred times in the last week, and it has stopped registering as unusual.</w:t>
+      </w:r>
+    </w:p>
+    <w:p>
+      <w:pPr>
+        <w:pStyle w:val="RRBodyText2"/>
+      </w:pPr>
+      <w:r>
+        <w:t>Now do this. Imagine a twenty-four-year-old you have been mentoring. Bright, works hard, good instincts. They come to you having done exactly what you did — same instrument, same size, same catastrophic hold. They are sitting across from you and they cannot meet your eye.</w:t>
+      </w:r>
+    </w:p>
+    <w:p>
+      <w:pPr>
+        <w:pStyle w:val="RRBodyText2"/>
+      </w:pPr>
+      <w:r>
+        <w:t>Say the shower sentence to them.</w:t>
+      </w:r>
+    </w:p>
+    <w:p>
+      <w:pPr>
+        <w:pStyle w:val="RRBodyText2"/>
+      </w:pPr>
+      <w:r>
+        <w:t>You would not. You would not get within a mile of it, and if you heard another senior trader say it to them you would end that man’s involvement in their development permanently. So there is a standard of decency you enforce in every direction except one.</w:t>
+      </w:r>
+    </w:p>
+    <w:p>
+      <w:pPr>
+        <w:pStyle w:val="RRBodyText2"/>
+      </w:pPr>
+      <w:r>
+        <w:t>Today we make the case — not on sentimental grounds but on evidence — that the exception is costing you the rebuild.</w:t>
+      </w:r>
+    </w:p>
+    <w:p>
+      <w:pPr>
+        <w:pStyle w:val="RRSectionHead"/>
+      </w:pPr>
+      <w:r>
+        <w:t>What Is Happening In Your Brain</w:t>
+      </w:r>
+    </w:p>
+    <w:p>
+      <w:pPr>
+        <w:pStyle w:val="RRBodyText2"/>
+      </w:pPr>
+      <w:r>
+        <w:t>There is a belief buried deep in trading culture, and in most high-performance culture, that self-attack is the engine of standards. Go easy on yourself and you get soft. The lash is what keeps you sharp.</w:t>
+      </w:r>
+    </w:p>
+    <w:p>
+      <w:pPr>
+        <w:pStyle w:val="RRBodyText2"/>
+      </w:pPr>
+      <w:r>
+        <w:t>The research says the opposite, and it says it in the one currency you care about: subsequent behaviour.</w:t>
+      </w:r>
+    </w:p>
+    <w:p>
+      <w:pPr>
+        <w:pStyle w:val="RRBodyText2"/>
+      </w:pPr>
+      <w:r>
+        <w:t>The clearest demonstration comes from work by Juliana Breines and Serena Chen. Participants who had failed at something, or had done something they felt bad about, were split into groups. One group was directed to take a self-compassionate view — to treat the failure as something that happens to human beings, and to speak to themselves accordingly. Another was given a self-esteem boost instead, reminded of their good qualities. A third got neither.</w:t>
+      </w:r>
+    </w:p>
+    <w:p>
+      <w:pPr>
+        <w:pStyle w:val="RRBodyText2"/>
+      </w:pPr>
+      <w:r>
+        <w:t xml:space="preserve">The self-compassionate group did not become complacent. They showed </w:t>
+      </w:r>
+      <w:r>
+        <w:rPr>
+          <w:b/>
+        </w:rPr>
+        <w:t>greater motivation to change, more willingness to make amends, and more time spent studying after a failed test</w:t>
+      </w:r>
+      <w:r>
+        <w:t xml:space="preserve"> than the others. Across this literature the pattern repeats: self-compassion is associated with </w:t>
+      </w:r>
+      <w:r>
+        <w:rPr>
+          <w:i/>
+        </w:rPr>
+        <w:t>more</w:t>
+      </w:r>
+      <w:r>
+        <w:t xml:space="preserve"> personal accountability, not less. Self-criticism, by contrast, predicts avoidance — and avoidance is the enemy here, because the trader who cannot bear to look at his own records cannot audit them, and the trader who cannot audit cannot improve.</w:t>
+      </w:r>
+    </w:p>
+    <w:p>
+      <w:pPr>
+        <w:pStyle w:val="RRBodyText2"/>
+      </w:pPr>
+      <w:r>
+        <w:t>The mechanism is not mysterious. Self-attack triggers the threat system. A threatened animal hides, freezes, or lashes out — none of which are learning states. To examine your worst trade honestly you need to be calm enough to look at it for an hour without flinching, and you cannot get calm while something in your own head is hunting you.</w:t>
+      </w:r>
+    </w:p>
+    <w:p>
+      <w:pPr>
+        <w:pStyle w:val="RRBodyText2"/>
+      </w:pPr>
+      <w:r>
+        <w:t xml:space="preserve">There is a distinction that makes this practical, and it is not the one people expect. Self-compassion is </w:t>
+      </w:r>
+      <w:r>
+        <w:rPr>
+          <w:b/>
+        </w:rPr>
+        <w:t>not</w:t>
+      </w:r>
+      <w:r>
+        <w:t xml:space="preserve"> the same as self-esteem. Self-esteem is a judgement — </w:t>
+      </w:r>
+      <w:r>
+        <w:rPr>
+          <w:i/>
+        </w:rPr>
+        <w:t>I am good, I am above average, I am a winner</w:t>
+      </w:r>
+      <w:r>
+        <w:t xml:space="preserve"> — and it requires evidence, which is exactly what you have just lost. It collapses at the worst possible moment. Self-compassion makes no judgement at all. It says: </w:t>
+      </w:r>
+      <w:r>
+        <w:rPr>
+          <w:i/>
+        </w:rPr>
+        <w:t>this is painful, pain like this is part of being a person, and I will treat myself as I would treat someone I was responsible for.</w:t>
+      </w:r>
+      <w:r>
+        <w:t xml:space="preserve"> It is available when you are failing, which is the only time it is needed.</w:t>
+      </w:r>
+    </w:p>
+    <w:p>
+      <w:pPr>
+        <w:pStyle w:val="RRBodyText2"/>
+      </w:pPr>
+      <w:r>
+        <w:t>Kristin Neff, who built the measurement instruments for this field, describes three components: kindness rather than harshness; recognising your experience as part of common humanity rather than an isolating defect; and holding the pain in balanced awareness rather than either suppressing it or drowning in it. You have been running the exact inverse of all three, and you have been calling it professionalism.</w:t>
+      </w:r>
+    </w:p>
+    <w:p>
+      <w:pPr>
+        <w:pStyle w:val="RRSectionHead"/>
+      </w:pPr>
+      <w:r>
+        <w:t>What the Word Says To It</w:t>
+      </w:r>
+    </w:p>
+    <w:p>
+      <w:pPr>
+        <w:pStyle w:val="RRBodyText2"/>
+      </w:pPr>
+      <w:r>
+        <w:rPr>
+          <w:i/>
+        </w:rPr>
+        <w:t>“There is therefore now no condemnation.”</w:t>
+      </w:r>
+    </w:p>
+    <w:p>
+      <w:pPr>
+        <w:pStyle w:val="RRBodyText2"/>
+      </w:pPr>
+      <w:r>
+        <w:t>Sit on each of those words, because Paul chose them under pressure and none is decorative.</w:t>
+      </w:r>
+    </w:p>
+    <w:p>
+      <w:pPr>
+        <w:pStyle w:val="RRBodyText2"/>
+      </w:pPr>
+      <w:r>
+        <w:rPr>
+          <w:b/>
+        </w:rPr>
+        <w:t>No</w:t>
+      </w:r>
+      <w:r>
+        <w:t xml:space="preserve"> — not </w:t>
+      </w:r>
+      <w:r>
+        <w:rPr>
+          <w:i/>
+        </w:rPr>
+        <w:t>reduced</w:t>
+      </w:r>
+      <w:r>
+        <w:t xml:space="preserve">, not </w:t>
+      </w:r>
+      <w:r>
+        <w:rPr>
+          <w:i/>
+        </w:rPr>
+        <w:t>proportionate</w:t>
+      </w:r>
+      <w:r>
+        <w:t xml:space="preserve">, not </w:t>
+      </w:r>
+      <w:r>
+        <w:rPr>
+          <w:i/>
+        </w:rPr>
+        <w:t>suspended pending review</w:t>
+      </w:r>
+      <w:r>
+        <w:t xml:space="preserve">. </w:t>
+      </w:r>
+      <w:r>
+        <w:rPr>
+          <w:b/>
+        </w:rPr>
+        <w:t>Now</w:t>
+      </w:r>
+      <w:r>
+        <w:t xml:space="preserve"> — not after a probation period in which you demonstrate improvement. </w:t>
+      </w:r>
+      <w:r>
+        <w:rPr>
+          <w:b/>
+        </w:rPr>
+        <w:t>Condemnation</w:t>
+      </w:r>
+      <w:r>
+        <w:t xml:space="preserve"> — the courtroom word. The verdict on the person, not the assessment of the act.</w:t>
+      </w:r>
+    </w:p>
+    <w:p>
+      <w:pPr>
+        <w:pStyle w:val="RRBodyText2"/>
+      </w:pPr>
+      <w:r>
+        <w:t xml:space="preserve">Paul is not saying the act did not matter. He spends whole letters on how much acts matter. He is saying the </w:t>
+      </w:r>
+      <w:r>
+        <w:rPr>
+          <w:i/>
+        </w:rPr>
+        <w:t>tribunal is closed</w:t>
+      </w:r>
+      <w:r>
+        <w:t>. The gavel has come down, and it did not come down on you.</w:t>
+      </w:r>
+    </w:p>
+    <w:p>
+      <w:pPr>
+        <w:pStyle w:val="RRBodyText2"/>
+      </w:pPr>
+      <w:r>
+        <w:t>Here is the thing to see, though, and it is what makes this a hard verse rather than a comfortable one. If there is no condemnation from God, then the condemnation you are running in the shower has no authority behind it. You have appointed yourself to a bench that has been abolished. That voice is not the voice of high standards, and it is not the voice of God, who has explicitly recused Himself from the prosecution. It is just a voice, running an old script, with no jurisdiction.</w:t>
+      </w:r>
+    </w:p>
+    <w:p>
+      <w:pPr>
+        <w:pStyle w:val="RRBodyText2"/>
+      </w:pPr>
+      <w:r>
+        <w:t>You may still hold yourself to account. Day 8 will require it of you in detail. But accounting and condemning are different courts, and only one of them is still sitting.</w:t>
+      </w:r>
+    </w:p>
+    <w:p>
+      <w:pPr>
+        <w:pStyle w:val="RRSectionHead"/>
+      </w:pPr>
+      <w:r>
+        <w:t>The Meditation</w:t>
+      </w:r>
+    </w:p>
+    <w:p>
+      <w:pPr>
+        <w:pStyle w:val="RRMeditation"/>
+      </w:pPr>
+      <w:r>
+        <w:t>Four minutes. Sit. Hands open on your knees.</w:t>
+      </w:r>
+    </w:p>
+    <w:p>
+      <w:pPr>
+        <w:pStyle w:val="RRMeditation"/>
+      </w:pPr>
+      <w:r>
+        <w:t>Breathe in for four, out for six, six times.</w:t>
+      </w:r>
+    </w:p>
+    <w:p>
+      <w:pPr>
+        <w:pStyle w:val="RRMeditation"/>
+      </w:pPr>
+      <w:r>
+        <w:t>Now bring to mind the twenty-four-year-old — the one you were mentoring a moment ago. See them across from you, unable to look up.</w:t>
+      </w:r>
+    </w:p>
+    <w:p>
+      <w:pPr>
+        <w:pStyle w:val="RRMeditation"/>
+      </w:pPr>
+      <w:r>
+        <w:t xml:space="preserve">Say to them, silently and slowly, what you would actually say. </w:t>
+      </w:r>
+      <w:r>
+        <w:rPr>
+          <w:i/>
+        </w:rPr>
+        <w:t>This is survivable. You are not the first. We are going to look at it together and you are not going to do it alone.</w:t>
+      </w:r>
+      <w:r>
+        <w:t xml:space="preserve"> Let yourself feel the warmth that comes with saying it, because it is real; it is the same warmth you would feel in the room.</w:t>
+      </w:r>
+    </w:p>
+    <w:p>
+      <w:pPr>
+        <w:pStyle w:val="RRMeditation"/>
+      </w:pPr>
+      <w:r>
+        <w:t>Now — and this is the whole exercise — turn and say the same words to yourself, in the same tone. Not a different, sterner version. The same words.</w:t>
+      </w:r>
+    </w:p>
+    <w:p>
+      <w:pPr>
+        <w:pStyle w:val="RRMeditation"/>
+      </w:pPr>
+      <w:r>
+        <w:t>It will feel false. Say it anyway. Day 14 explains why saying it before believing it is not dishonesty but training.</w:t>
+      </w:r>
+    </w:p>
+    <w:p>
+      <w:pPr>
+        <w:pStyle w:val="RRMeditation"/>
+      </w:pPr>
+      <w:r>
+        <w:t xml:space="preserve">Close with: </w:t>
+      </w:r>
+      <w:r>
+        <w:rPr>
+          <w:i/>
+        </w:rPr>
+        <w:t>“No condemnation.”</w:t>
+      </w:r>
+      <w:r>
+        <w:t xml:space="preserve"> One long exhale.</w:t>
+      </w:r>
+    </w:p>
+    <w:p>
+      <w:pPr>
+        <w:pStyle w:val="RRSectionHead"/>
+      </w:pPr>
+      <w:r>
+        <w:t>Say It Out Loud</w:t>
+      </w:r>
+    </w:p>
+    <w:p>
+      <w:pPr>
+        <w:pStyle w:val="RRAffirmation"/>
+      </w:pPr>
+      <w:r>
+        <w:t>“I made a catastrophic mistake, and I am not a catastrophe.”</w:t>
+      </w:r>
+    </w:p>
+    <w:p>
+      <w:pPr>
+        <w:pStyle w:val="RRAffirmation"/>
+      </w:pPr>
+      <w:r>
+        <w:t>“I will speak to myself in the voice I would use with someone I was responsible for.”</w:t>
+      </w:r>
+    </w:p>
+    <w:p>
+      <w:pPr>
+        <w:pStyle w:val="RRAffirmation"/>
+      </w:pPr>
+      <w:r>
+        <w:t>“God has closed the court; I will not reopen it in my own head.”</w:t>
+      </w:r>
+    </w:p>
+    <w:p>
+      <w:pPr>
+        <w:pStyle w:val="RRSectionHead"/>
+      </w:pPr>
+      <w:r>
+        <w:t>Today’s Small Thing</w:t>
+      </w:r>
+    </w:p>
+    <w:p>
+      <w:pPr>
+        <w:pStyle w:val="RRBodyText2"/>
+      </w:pPr>
+      <w:r>
+        <w:t>Catch it once, in writing.</w:t>
+      </w:r>
+    </w:p>
+    <w:p>
+      <w:pPr>
+        <w:pStyle w:val="RRBodyText2"/>
+      </w:pPr>
+      <w:r>
+        <w:t xml:space="preserve">The next time the sentence comes — </w:t>
+      </w:r>
+      <w:r>
+        <w:rPr>
+          <w:i/>
+        </w:rPr>
+        <w:t>idiot</w:t>
+      </w:r>
+      <w:r>
+        <w:t xml:space="preserve">, </w:t>
+      </w:r>
+      <w:r>
+        <w:rPr>
+          <w:i/>
+        </w:rPr>
+        <w:t>pathetic</w:t>
+      </w:r>
+      <w:r>
+        <w:t>, whatever your particular one is — write it down word for word in the notebook. Underneath it, write what you would say to the twenty-four-year-old in the same situation.</w:t>
+      </w:r>
+    </w:p>
+    <w:p>
+      <w:pPr>
+        <w:pStyle w:val="RRBodyText2"/>
+      </w:pPr>
+      <w:r>
+        <w:t xml:space="preserve">Once is enough today. You are not trying to win the argument. You are only proving that the voice is a </w:t>
+      </w:r>
+      <w:r>
+        <w:rPr>
+          <w:i/>
+        </w:rPr>
+        <w:t>voice</w:t>
+      </w:r>
+      <w:r>
+        <w:t xml:space="preserve"> rather than a fact, and that a second voice exists.</w:t>
+      </w:r>
+    </w:p>
+    <w:p>
+      <w:pPr>
+        <w:pStyle w:val="RRSectionHead"/>
+      </w:pPr>
+      <w:r>
+        <w:t>Carry This</w:t>
+      </w:r>
+    </w:p>
+    <w:p>
+      <w:pPr>
+        <w:pStyle w:val="RRCarryThis"/>
+      </w:pPr>
+      <w:r>
+        <w:t>I would not let anyone speak to a person in my care the way I have been speaking to myself, and I am in my own care.</w:t>
+      </w:r>
+    </w:p>
+    <w:p>
+      <w:pPr>
+        <w:pStyle w:val="RRBodyText2"/>
+        <w:spacing w:after="0"/>
+      </w:pPr>
+      <w:r>
+        <w:br w:type="page"/>
+      </w:r>
+    </w:p>
+    <w:p>
+      <w:pPr>
+        <w:pStyle w:val="RRDayKicker"/>
+      </w:pPr>
+      <w:r>
+        <w:t>Day 7</w:t>
+      </w:r>
+    </w:p>
+    <w:p>
+      <w:pPr>
+        <w:pStyle w:val="RRDayTitle"/>
+      </w:pPr>
+      <w:r>
+        <w:t>Forgiving the Trader You Were</w:t>
+      </w:r>
+    </w:p>
+    <w:p>
+      <w:pPr>
+        <w:pStyle w:val="RRSectionHead"/>
+      </w:pPr>
+      <w:r>
+        <w:t>The Word</w:t>
+      </w:r>
+    </w:p>
+    <w:p>
+      <w:pPr>
+        <w:pStyle w:val="RRVerse"/>
+      </w:pPr>
+      <w:r>
+        <w:t>“Come now, and let us reason together,” says Yahweh: “Though your sins are as scarlet, they shall be as white as snow. Though they are red like crimson, they shall be as wool.”</w:t>
+      </w:r>
+    </w:p>
+    <w:p>
+      <w:pPr>
+        <w:pStyle w:val="RRVerseRef"/>
+      </w:pPr>
+      <w:r>
+        <w:t>Isaiah 1:18</w:t>
+      </w:r>
+    </w:p>
+    <w:p>
+      <w:pPr>
+        <w:pStyle w:val="RRSectionHead"/>
+      </w:pPr>
+      <w:r>
+        <w:t>Where You Are Today</w:t>
+      </w:r>
+    </w:p>
+    <w:p>
+      <w:pPr>
+        <w:pStyle w:val="RRBodyText2"/>
+      </w:pPr>
+      <w:r>
+        <w:t>There is one memory that is worse than the loss, and it is not a memory of the market.</w:t>
+      </w:r>
+    </w:p>
+    <w:p>
+      <w:pPr>
+        <w:pStyle w:val="RRBodyText2"/>
+      </w:pPr>
+      <w:r>
+        <w:t>It is the memory of yourself. Maybe it is the message you sent — the confident one, with the numbers in it, to someone whose opinion of you mattered. Maybe it is the moment you told your partner you had it handled, in that reassuring voice, while you already knew you did not. Maybe it is the smaller one: the way you spoke about a colleague’s caution six weeks ago, and how pleased you were with yourself.</w:t>
+      </w:r>
+    </w:p>
+    <w:p>
+      <w:pPr>
+        <w:pStyle w:val="RRBodyText2"/>
+      </w:pPr>
+      <w:r>
+        <w:t xml:space="preserve">Whichever it is, when it surfaces your face goes hot and something in your body physically turns away. You have caught yourself, several times this week, making a small involuntary noise — a hiss, a </w:t>
+      </w:r>
+      <w:r>
+        <w:rPr>
+          <w:i/>
+        </w:rPr>
+        <w:t>no</w:t>
+      </w:r>
+      <w:r>
+        <w:t xml:space="preserve"> under your breath — as though you could interrupt the memory by making a sound.</w:t>
+      </w:r>
+    </w:p>
+    <w:p>
+      <w:pPr>
+        <w:pStyle w:val="RRBodyText2"/>
+      </w:pPr>
+      <w:r>
+        <w:t>That reaction has a name. It is not guilt. And the difference between what it is and what you think it is will decide whether the next year of your life is a rebuild or a slow retreat.</w:t>
+      </w:r>
+    </w:p>
+    <w:p>
+      <w:pPr>
+        <w:pStyle w:val="RRSectionHead"/>
+      </w:pPr>
+      <w:r>
+        <w:t>What Is Happening In Your Brain</w:t>
+      </w:r>
+    </w:p>
+    <w:p>
+      <w:pPr>
+        <w:pStyle w:val="RRBodyText2"/>
+      </w:pPr>
+      <w:r>
+        <w:t>June Tangney and her colleagues spent decades separating two emotions that ordinary language mashes together.</w:t>
+      </w:r>
+    </w:p>
+    <w:p>
+      <w:pPr>
+        <w:pStyle w:val="RRBodyText2"/>
+      </w:pPr>
+      <w:r>
+        <w:rPr>
+          <w:b/>
+        </w:rPr>
+        <w:t>Guilt</w:t>
+      </w:r>
+      <w:r>
+        <w:t xml:space="preserve"> is about behaviour. </w:t>
+      </w:r>
+      <w:r>
+        <w:rPr>
+          <w:i/>
+        </w:rPr>
+        <w:t>I did a bad thing.</w:t>
+      </w:r>
+      <w:r>
+        <w:t xml:space="preserve"> Its focus is the act, and its characteristic impulse is repair — to confess, apologise, fix, make good.</w:t>
+      </w:r>
+    </w:p>
+    <w:p>
+      <w:pPr>
+        <w:pStyle w:val="RRBodyText2"/>
+      </w:pPr>
+      <w:r>
+        <w:rPr>
+          <w:b/>
+        </w:rPr>
+        <w:t>Shame</w:t>
+      </w:r>
+      <w:r>
+        <w:t xml:space="preserve"> is about the self. </w:t>
+      </w:r>
+      <w:r>
+        <w:rPr>
+          <w:i/>
+        </w:rPr>
+        <w:t>I am a bad thing.</w:t>
+      </w:r>
+      <w:r>
+        <w:t xml:space="preserve"> Its focus is your whole person as viewed by an imagined audience, and its characteristic impulse is to </w:t>
+      </w:r>
+      <w:r>
+        <w:rPr>
+          <w:b/>
+        </w:rPr>
+        <w:t>disappear</w:t>
+      </w:r>
+      <w:r>
+        <w:t xml:space="preserve"> — to hide, to avoid the person who saw, to get out of the room.</w:t>
+      </w:r>
+    </w:p>
+    <w:p>
+      <w:pPr>
+        <w:pStyle w:val="RRBodyText2"/>
+      </w:pPr>
+      <w:r>
+        <w:t>They feel similar from the inside. Their consequences are opposite.</w:t>
+      </w:r>
+    </w:p>
+    <w:p>
+      <w:pPr>
+        <w:pStyle w:val="RRBodyText2"/>
+      </w:pPr>
+      <w:r>
+        <w:t xml:space="preserve">Across a large body of research, guilt is consistently associated with constructive outcomes: taking responsibility, empathy for those affected, and actually changing behaviour. Shame is associated with the reverse. Shame-prone people show </w:t>
+      </w:r>
+      <w:r>
+        <w:rPr>
+          <w:i/>
+        </w:rPr>
+        <w:t>more</w:t>
+      </w:r>
+      <w:r>
+        <w:t xml:space="preserve"> defensiveness, more externalising of blame, more anger, and more avoidance. In studies of prison populations, shame predicted reoffending; guilt predicted desistance. That is a striking result and it should reframe how you read your own hissing this week: the emotion that feels the most morally serious is the one that most reliably fails to produce moral improvement.</w:t>
+      </w:r>
+    </w:p>
+    <w:p>
+      <w:pPr>
+        <w:pStyle w:val="RRBodyText2"/>
+      </w:pPr>
+      <w:r>
+        <w:t>Why? Because shame’s impulse is concealment, and concealment is incompatible with correction. You cannot fix what you will not look at. And you will not look at something that, every time you look, tells you that you are contemptible.</w:t>
+      </w:r>
+    </w:p>
+    <w:p>
+      <w:pPr>
+        <w:pStyle w:val="RRBodyText2"/>
+      </w:pPr>
+      <w:r>
+        <w:t>Watch how this is about to play out in your trading, because the pattern is predictable. The shamed trader stops opening his journal. He avoids the friend who knew about the position. He does not tell his risk manager the full size. He starts trading in a way designed to make the shame go away rather than to make money — which means chasing the loss back, which means the second blow-up, which is nearly always worse than the first and nearly always the one that ends the career.</w:t>
+      </w:r>
+    </w:p>
+    <w:p>
+      <w:pPr>
+        <w:pStyle w:val="RRBodyText2"/>
+      </w:pPr>
+      <w:r>
+        <w:t>You need the guilt. Keep every ounce of it — tomorrow we are going to put it to work in writing. What has to go is the verdict on the person, because that verdict is what will drive you into hiding.</w:t>
+      </w:r>
+    </w:p>
+    <w:p>
+      <w:pPr>
+        <w:pStyle w:val="RRSectionHead"/>
+      </w:pPr>
+      <w:r>
+        <w:t>What the Word Says To It</w:t>
+      </w:r>
+    </w:p>
+    <w:p>
+      <w:pPr>
+        <w:pStyle w:val="RRBodyText2"/>
+      </w:pPr>
+      <w:r>
+        <w:t xml:space="preserve">Notice what God does </w:t>
+      </w:r>
+      <w:r>
+        <w:rPr>
+          <w:i/>
+        </w:rPr>
+        <w:t>not</w:t>
+      </w:r>
+      <w:r>
+        <w:t xml:space="preserve"> do in Isaiah’s invitation.</w:t>
+      </w:r>
+    </w:p>
+    <w:p>
+      <w:pPr>
+        <w:pStyle w:val="RRBodyText2"/>
+      </w:pPr>
+      <w:r>
+        <w:t xml:space="preserve">He does not minimise. The word is </w:t>
+      </w:r>
+      <w:r>
+        <w:rPr>
+          <w:i/>
+        </w:rPr>
+        <w:t>scarlet</w:t>
+      </w:r>
+      <w:r>
+        <w:t xml:space="preserve"> — the colour of blood, of an indelible dye, chosen precisely because it was the hardest stain to remove from cloth. There is no suggestion here that the thing was smaller than it looked, or that circumstances explain it, or that everyone does it. The severity is granted in full.</w:t>
+      </w:r>
+    </w:p>
+    <w:p>
+      <w:pPr>
+        <w:pStyle w:val="RRBodyText2"/>
+      </w:pPr>
+      <w:r>
+        <w:t xml:space="preserve">And then, in the same breath: </w:t>
+      </w:r>
+      <w:r>
+        <w:rPr>
+          <w:i/>
+        </w:rPr>
+        <w:t>they shall be as white as snow.</w:t>
+      </w:r>
+    </w:p>
+    <w:p>
+      <w:pPr>
+        <w:pStyle w:val="RRBodyText2"/>
+      </w:pPr>
+      <w:r>
+        <w:t>The two halves of that verse should not fit together, and the fact that they do is the entire scandal of grace. Full acknowledgement of the wrong, and full removal of the stain, held in one sentence without either cancelling the other. That combination is exactly what you cannot manufacture on your own — which is why people oscillate between excusing themselves and flagellating themselves, and find no rest in either.</w:t>
+      </w:r>
+    </w:p>
+    <w:p>
+      <w:pPr>
+        <w:pStyle w:val="RRBodyText2"/>
+      </w:pPr>
+      <w:r>
+        <w:t xml:space="preserve">And look at the opening: </w:t>
+      </w:r>
+      <w:r>
+        <w:rPr>
+          <w:i/>
+        </w:rPr>
+        <w:t>“Come now, and let us reason together.”</w:t>
+      </w:r>
+      <w:r>
+        <w:t xml:space="preserve"> An invitation to a conversation. The last thing shame wants is to be summoned into a conversation; shame’s whole programme is to get out of the room. God’s first move is to call you back into it.</w:t>
+      </w:r>
+    </w:p>
+    <w:p>
+      <w:pPr>
+        <w:pStyle w:val="RRBodyText2"/>
+      </w:pPr>
+      <w:r>
+        <w:t>So: what you actually did was as bad as you think. And you are not what you did. Both. Today.</w:t>
+      </w:r>
+    </w:p>
+    <w:p>
+      <w:pPr>
+        <w:pStyle w:val="RRSectionHead"/>
+      </w:pPr>
+      <w:r>
+        <w:t>The Meditation</w:t>
+      </w:r>
+    </w:p>
+    <w:p>
+      <w:pPr>
+        <w:pStyle w:val="RRMeditation"/>
+      </w:pPr>
+      <w:r>
+        <w:t>Five minutes. Sit down somewhere private.</w:t>
+      </w:r>
+    </w:p>
+    <w:p>
+      <w:pPr>
+        <w:pStyle w:val="RRMeditation"/>
+      </w:pPr>
+      <w:r>
+        <w:t>Breathe in for four, out for six, six times.</w:t>
+      </w:r>
+    </w:p>
+    <w:p>
+      <w:pPr>
+        <w:pStyle w:val="RRMeditation"/>
+      </w:pPr>
+      <w:r>
+        <w:t>Now bring up the memory — the specific one, the hot one. Do not push it away and do not let it run its usual film. Just hold it there, at arm’s length, like a document.</w:t>
+      </w:r>
+    </w:p>
+    <w:p>
+      <w:pPr>
+        <w:pStyle w:val="RRMeditation"/>
+      </w:pPr>
+      <w:r>
+        <w:t>Say two sentences about it, in this order, out loud, and do not swap the order:</w:t>
+      </w:r>
+    </w:p>
+    <w:p>
+      <w:pPr>
+        <w:pStyle w:val="RRMeditation"/>
+      </w:pPr>
+      <w:r>
+        <w:rPr>
+          <w:i/>
+        </w:rPr>
+        <w:t>“What I did was wrong, and I am not going to pretend otherwise.”</w:t>
+      </w:r>
+    </w:p>
+    <w:p>
+      <w:pPr>
+        <w:pStyle w:val="RRMeditation"/>
+      </w:pPr>
+      <w:r>
+        <w:t>Then, slowly:</w:t>
+      </w:r>
+    </w:p>
+    <w:p>
+      <w:pPr>
+        <w:pStyle w:val="RRMeditation"/>
+      </w:pPr>
+      <w:r>
+        <w:rPr>
+          <w:i/>
+        </w:rPr>
+        <w:t>“And it is not what I am.”</w:t>
+      </w:r>
+    </w:p>
+    <w:p>
+      <w:pPr>
+        <w:pStyle w:val="RRMeditation"/>
+      </w:pPr>
+      <w:r>
+        <w:t>Hold the memory for another few seconds while the second sentence is still in the air. Then let it go and return to the breath.</w:t>
+      </w:r>
+    </w:p>
+    <w:p>
+      <w:pPr>
+        <w:pStyle w:val="RRMeditation"/>
+      </w:pPr>
+      <w:r>
+        <w:t xml:space="preserve">Repeat the pair twice more. On the third time, add: </w:t>
+      </w:r>
+      <w:r>
+        <w:rPr>
+          <w:i/>
+        </w:rPr>
+        <w:t>“Though they are red like crimson, they shall be as wool.”</w:t>
+      </w:r>
+    </w:p>
+    <w:p>
+      <w:pPr>
+        <w:pStyle w:val="RRMeditation"/>
+      </w:pPr>
+      <w:r>
+        <w:t>Finish with one long exhale.</w:t>
+      </w:r>
+    </w:p>
+    <w:p>
+      <w:pPr>
+        <w:pStyle w:val="RRSectionHead"/>
+      </w:pPr>
+      <w:r>
+        <w:t>Say It Out Loud</w:t>
+      </w:r>
+    </w:p>
+    <w:p>
+      <w:pPr>
+        <w:pStyle w:val="RRAffirmation"/>
+      </w:pPr>
+      <w:r>
+        <w:t>“I take full responsibility for what I did, and I refuse the verdict that I am worthless for having done it.”</w:t>
+      </w:r>
+    </w:p>
+    <w:p>
+      <w:pPr>
+        <w:pStyle w:val="RRAffirmation"/>
+      </w:pPr>
+      <w:r>
+        <w:t>“Shame tells me to hide; I am choosing to stay in the room.”</w:t>
+      </w:r>
+    </w:p>
+    <w:p>
+      <w:pPr>
+        <w:pStyle w:val="RRAffirmation"/>
+      </w:pPr>
+      <w:r>
+        <w:t>“God does not minimise what I did, and He does not condemn who I am.”</w:t>
+      </w:r>
+    </w:p>
+    <w:p>
+      <w:pPr>
+        <w:pStyle w:val="RRSectionHead"/>
+      </w:pPr>
+      <w:r>
+        <w:t>Today’s Small Thing</w:t>
+      </w:r>
+    </w:p>
+    <w:p>
+      <w:pPr>
+        <w:pStyle w:val="RRBodyText2"/>
+      </w:pPr>
+      <w:r>
+        <w:t>Say it to one person who saw.</w:t>
+      </w:r>
+    </w:p>
+    <w:p>
+      <w:pPr>
+        <w:pStyle w:val="RRBodyText2"/>
+      </w:pPr>
+      <w:r>
+        <w:t xml:space="preserve">Not a confession of everything — that is tomorrow, and it goes on paper. Today: find the one person you have been avoiding since it happened, the one whose face you cannot picture without wincing, and make contact. A message is enough. </w:t>
+      </w:r>
+      <w:r>
+        <w:rPr>
+          <w:i/>
+        </w:rPr>
+        <w:t>I’ve been avoiding you because I’m embarrassed. That’s all it is. I’m not doing great, but I’m working on it.</w:t>
+      </w:r>
+    </w:p>
+    <w:p>
+      <w:pPr>
+        <w:pStyle w:val="RRBodyText2"/>
+      </w:pPr>
+      <w:r>
+        <w:t>Shame’s programme is avoidance. Every avoided person is a room you can no longer enter. Take one room back today.</w:t>
+      </w:r>
+    </w:p>
+    <w:p>
+      <w:pPr>
+        <w:pStyle w:val="RRSectionHead"/>
+      </w:pPr>
+      <w:r>
+        <w:t>Carry This</w:t>
+      </w:r>
+    </w:p>
+    <w:p>
+      <w:pPr>
+        <w:pStyle w:val="RRCarryThis"/>
+      </w:pPr>
+      <w:r>
+        <w:t>I am not being asked to think less of what I did — only to stop concluding, from what I did, that I should not be seen.</w:t>
+      </w:r>
+    </w:p>
+    <w:p>
+      <w:pPr>
+        <w:pStyle w:val="RRBodyText2"/>
+        <w:spacing w:after="0"/>
+      </w:pPr>
+      <w:r>
+        <w:br w:type="page"/>
+      </w:r>
+    </w:p>
+    <w:p>
+      <w:pPr>
+        <w:pStyle w:val="RRDayKicker"/>
+      </w:pPr>
+      <w:r>
+        <w:t>Day 8</w:t>
+      </w:r>
+    </w:p>
+    <w:p>
+      <w:pPr>
+        <w:pStyle w:val="RRDayTitle"/>
+      </w:pPr>
+      <w:r>
+        <w:t>The Honest Ledger</w:t>
+      </w:r>
+    </w:p>
+    <w:p>
+      <w:pPr>
+        <w:pStyle w:val="RRSectionHead"/>
+      </w:pPr>
+      <w:r>
+        <w:t>The Word</w:t>
+      </w:r>
+    </w:p>
+    <w:p>
+      <w:pPr>
+        <w:pStyle w:val="RRVerse"/>
+      </w:pPr>
+      <w:r>
+        <w:t>He who conceals his sins doesn’t prosper, but whoever confesses and renounces them finds mercy.</w:t>
+      </w:r>
+    </w:p>
+    <w:p>
+      <w:pPr>
+        <w:pStyle w:val="RRVerseRef"/>
+      </w:pPr>
+      <w:r>
+        <w:t>Proverbs 28:13</w:t>
+      </w:r>
+    </w:p>
+    <w:p>
+      <w:pPr>
+        <w:pStyle w:val="RRSectionHead"/>
+      </w:pPr>
+      <w:r>
+        <w:t>Where You Are Today</w:t>
+      </w:r>
+    </w:p>
+    <w:p>
+      <w:pPr>
+        <w:pStyle w:val="RRBodyText2"/>
+      </w:pPr>
+      <w:r>
+        <w:t>You have a version of the story now. You have told it three or four times, and it has settled into a shape.</w:t>
+      </w:r>
+    </w:p>
+    <w:p>
+      <w:pPr>
+        <w:pStyle w:val="RRBodyText2"/>
+      </w:pPr>
+      <w:r>
+        <w:t xml:space="preserve">In your version, the market did something structurally unreasonable. There was a print that made no sense. Liquidity vanished at exactly the wrong moment. Someone else’s fund was unwinding into you. You were, in the version you tell, </w:t>
+      </w:r>
+      <w:r>
+        <w:rPr>
+          <w:i/>
+        </w:rPr>
+        <w:t>unlucky</w:t>
+      </w:r>
+      <w:r>
+        <w:t xml:space="preserve"> — early on a thesis that was fundamentally correct.</w:t>
+      </w:r>
+    </w:p>
+    <w:p>
+      <w:pPr>
+        <w:pStyle w:val="RRBodyText2"/>
+      </w:pPr>
+      <w:r>
+        <w:t>Here is the difficult thing about your version: most of it is true. That is precisely what makes it dangerous. A story that is eighty per cent accurate is far harder to dislodge than a lie, because every time you examine it you find real evidence, and the twenty per cent that is missing is the twenty per cent that would have saved you.</w:t>
+      </w:r>
+    </w:p>
+    <w:p>
+      <w:pPr>
+        <w:pStyle w:val="RRBodyText2"/>
+      </w:pPr>
+      <w:r>
+        <w:t>Today you write the other version. This is the hardest day in the first ten, and it is the hinge on which the rest turns.</w:t>
+      </w:r>
+    </w:p>
+    <w:p>
+      <w:pPr>
+        <w:pStyle w:val="RRSectionHead"/>
+      </w:pPr>
+      <w:r>
+        <w:t>What Is Happening In Your Brain</w:t>
+      </w:r>
+    </w:p>
+    <w:p>
+      <w:pPr>
+        <w:pStyle w:val="RRBodyText2"/>
+      </w:pPr>
+      <w:r>
+        <w:t>James Pennebaker made a discovery in the 1980s that has been replicated hundreds of times, in dozens of populations, and it is one of the most robust interventions in psychology relative to how little it costs.</w:t>
+      </w:r>
+    </w:p>
+    <w:p>
+      <w:pPr>
+        <w:pStyle w:val="RRBodyText2"/>
+      </w:pPr>
+      <w:r>
+        <w:t>Ask people to write about a difficult experience for fifteen to twenty minutes a day, for three or four consecutive days, holding nothing back. Compare them against people who write about something neutral. Over the following months the writing group shows measurable benefits — better mood, fewer visits to the doctor, in some studies improved immune markers and, in one much-cited study of recently unemployed engineers, a significantly faster return to work.</w:t>
+      </w:r>
+    </w:p>
+    <w:p>
+      <w:pPr>
+        <w:pStyle w:val="RRBodyText2"/>
+      </w:pPr>
+      <w:r>
+        <w:t xml:space="preserve">But the </w:t>
+      </w:r>
+      <w:r>
+        <w:rPr>
+          <w:i/>
+        </w:rPr>
+        <w:t>mechanism</w:t>
+      </w:r>
+      <w:r>
+        <w:t xml:space="preserve"> matters far more than the headline, because it tells you how to do this correctly today.</w:t>
+      </w:r>
+    </w:p>
+    <w:p>
+      <w:pPr>
+        <w:pStyle w:val="RRBodyText2"/>
+      </w:pPr>
+      <w:r>
+        <w:t xml:space="preserve">It is not catharsis. Emotional discharge on its own does not produce the effect; studies where people merely vent do not show the same benefit. What predicts improvement is something visible in the language itself. When Pennebaker’s team analysed the texts, the people who improved were the ones whose writing </w:t>
+      </w:r>
+      <w:r>
+        <w:rPr>
+          <w:b/>
+        </w:rPr>
+        <w:t>changed across the sessions</w:t>
+      </w:r>
+      <w:r>
+        <w:t>. They started with fragments and raw feeling and moved, over three or four days, toward a coherent account — and their use of causal words (</w:t>
+      </w:r>
+      <w:r>
+        <w:rPr>
+          <w:i/>
+        </w:rPr>
+        <w:t>because</w:t>
+      </w:r>
+      <w:r>
+        <w:t xml:space="preserve">, </w:t>
+      </w:r>
+      <w:r>
+        <w:rPr>
+          <w:i/>
+        </w:rPr>
+        <w:t>therefore</w:t>
+      </w:r>
+      <w:r>
+        <w:t xml:space="preserve">, </w:t>
+      </w:r>
+      <w:r>
+        <w:rPr>
+          <w:i/>
+        </w:rPr>
+        <w:t>realise</w:t>
+      </w:r>
+      <w:r>
+        <w:t xml:space="preserve">, </w:t>
+      </w:r>
+      <w:r>
+        <w:rPr>
+          <w:i/>
+        </w:rPr>
+        <w:t>understand</w:t>
+      </w:r>
+      <w:r>
+        <w:t>) increased as they went.</w:t>
+      </w:r>
+    </w:p>
+    <w:p>
+      <w:pPr>
+        <w:pStyle w:val="RRBodyText2"/>
+      </w:pPr>
+      <w:r>
+        <w:t xml:space="preserve">In other words: the benefit comes from </w:t>
+      </w:r>
+      <w:r>
+        <w:rPr>
+          <w:b/>
+        </w:rPr>
+        <w:t>turning an experience into a story that hangs together</w:t>
+      </w:r>
+      <w:r>
+        <w:t>. An unprocessed catastrophe sits in the mind as a set of loose, high-charge fragments — the print, the silence, the phone call — each one able to ambush you independently. That is why Day 4’s tape keeps running: an incoherent memory keeps signalling that it is unfinished business. Writing it into a structured account with causes and consequences does not delete it. It files it.</w:t>
+      </w:r>
+    </w:p>
+    <w:p>
+      <w:pPr>
+        <w:pStyle w:val="RRBodyText2"/>
+      </w:pPr>
+      <w:r>
+        <w:t xml:space="preserve">There is a second reason to do this on paper today, and it belongs to your craft rather than your recovery. You cannot audit a process you have narrated away. Every professional review of a disaster — aviation, medicine, engineering — begins with a factual reconstruction </w:t>
+      </w:r>
+      <w:r>
+        <w:rPr>
+          <w:i/>
+        </w:rPr>
+        <w:t>before</w:t>
+      </w:r>
+      <w:r>
+        <w:t xml:space="preserve"> anyone is permitted to interpret. You are going to give your own blow-up the same treatment you would give any other systems failure, because that is what it was.</w:t>
+      </w:r>
+    </w:p>
+    <w:p>
+      <w:pPr>
+        <w:pStyle w:val="RRBodyText2"/>
+      </w:pPr>
+      <w:r>
+        <w:t>A warning, and please take it seriously. This exercise reliably makes people feel worse for a few hours afterwards. That is expected and it is not a sign you have done it wrong. Do not do it late at night, and do not do it if you are currently in the crisis territory described in the opening pages of this book.</w:t>
+      </w:r>
+    </w:p>
+    <w:p>
+      <w:pPr>
+        <w:pStyle w:val="RRSectionHead"/>
+      </w:pPr>
+      <w:r>
+        <w:t>What the Word Says To It</w:t>
+      </w:r>
+    </w:p>
+    <w:p>
+      <w:pPr>
+        <w:pStyle w:val="RRBodyText2"/>
+      </w:pPr>
+      <w:r>
+        <w:rPr>
+          <w:i/>
+        </w:rPr>
+        <w:t>“He who conceals his sins doesn’t prosper.”</w:t>
+      </w:r>
+    </w:p>
+    <w:p>
+      <w:pPr>
+        <w:pStyle w:val="RRBodyText2"/>
+      </w:pPr>
+      <w:r>
+        <w:t xml:space="preserve">The verb is worth pausing on. Not </w:t>
+      </w:r>
+      <w:r>
+        <w:rPr>
+          <w:i/>
+        </w:rPr>
+        <w:t>he who has sinned</w:t>
+      </w:r>
+      <w:r>
+        <w:t xml:space="preserve"> — every human being qualifies for that clause and Proverbs knows it. </w:t>
+      </w:r>
+      <w:r>
+        <w:rPr>
+          <w:b/>
+        </w:rPr>
+        <w:t>He who conceals.</w:t>
+      </w:r>
+      <w:r>
+        <w:t xml:space="preserve"> The concealment is the thing that blocks the road, not the failure itself.</w:t>
+      </w:r>
+    </w:p>
+    <w:p>
+      <w:pPr>
+        <w:pStyle w:val="RRBodyText2"/>
+      </w:pPr>
+      <w:r>
+        <w:t xml:space="preserve">And the alternative is not vague regret; it is two specific verbs. </w:t>
+      </w:r>
+      <w:r>
+        <w:rPr>
+          <w:i/>
+        </w:rPr>
+        <w:t>Confesses</w:t>
+      </w:r>
+      <w:r>
+        <w:t xml:space="preserve"> — says the thing accurately, in words, out loud or on paper. And </w:t>
+      </w:r>
+      <w:r>
+        <w:rPr>
+          <w:i/>
+        </w:rPr>
+        <w:t>renounces</w:t>
+      </w:r>
+      <w:r>
+        <w:t xml:space="preserve"> — turns from it, changes the practice. Naming without changing is sentiment; changing without naming is not possible, because you cannot turn from something you have not identified.</w:t>
+      </w:r>
+    </w:p>
+    <w:p>
+      <w:pPr>
+        <w:pStyle w:val="RRBodyText2"/>
+      </w:pPr>
+      <w:r>
+        <w:t xml:space="preserve">What arrives at the end of that sequence is </w:t>
+      </w:r>
+      <w:r>
+        <w:rPr>
+          <w:i/>
+        </w:rPr>
+        <w:t>mercy</w:t>
+      </w:r>
+      <w:r>
+        <w:t>. Not a lighter sentence. Mercy — and mercy has a texture that self-justification never has, because self-justification has to be maintained. It requires constant upkeep, a story defended in every retelling, a slight tension every time someone asks a question you have not prepared for. A person who has confessed accurately has nothing left to guard.</w:t>
+      </w:r>
+    </w:p>
+    <w:p>
+      <w:pPr>
+        <w:pStyle w:val="RRBodyText2"/>
+      </w:pPr>
+      <w:r>
+        <w:t>You have been carrying a version. Today you can put it down.</w:t>
+      </w:r>
+    </w:p>
+    <w:p>
+      <w:pPr>
+        <w:pStyle w:val="RRSectionHead"/>
+      </w:pPr>
+      <w:r>
+        <w:t>The Meditation</w:t>
+      </w:r>
+    </w:p>
+    <w:p>
+      <w:pPr>
+        <w:pStyle w:val="RRMeditation"/>
+      </w:pPr>
+      <w:r>
+        <w:t>Three minutes, before you write, not after.</w:t>
+      </w:r>
+    </w:p>
+    <w:p>
+      <w:pPr>
+        <w:pStyle w:val="RRMeditation"/>
+      </w:pPr>
+      <w:r>
+        <w:t>Sit. Breathe in for four, out for six, eight times — longer today, because we are deliberately lowering the alarm before opening a difficult file.</w:t>
+      </w:r>
+    </w:p>
+    <w:p>
+      <w:pPr>
+        <w:pStyle w:val="RRMeditation"/>
+      </w:pPr>
+      <w:r>
+        <w:t>Then pray this, in whatever words are yours, but include the substance of it:</w:t>
+      </w:r>
+    </w:p>
+    <w:p>
+      <w:pPr>
+        <w:pStyle w:val="RRMeditation"/>
+      </w:pPr>
+      <w:r>
+        <w:rPr>
+          <w:i/>
+        </w:rPr>
+        <w:t>“Search me. I am about to write something I do not want to write. Do not let me lie in it, and do not let me destroy myself in it either. Show me what was actually mine.”</w:t>
+      </w:r>
+    </w:p>
+    <w:p>
+      <w:pPr>
+        <w:pStyle w:val="RRMeditation"/>
+      </w:pPr>
+      <w:r>
+        <w:t>Sit in the quiet for thirty seconds. Then open the notebook.</w:t>
+      </w:r>
+    </w:p>
+    <w:p>
+      <w:pPr>
+        <w:pStyle w:val="RRSectionHead"/>
+      </w:pPr>
+      <w:r>
+        <w:t>Say It Out Loud</w:t>
+      </w:r>
+    </w:p>
+    <w:p>
+      <w:pPr>
+        <w:pStyle w:val="RRAffirmation"/>
+      </w:pPr>
+      <w:r>
+        <w:t>“The truth about what I did cannot hurt me more than hiding from it already has.”</w:t>
+      </w:r>
+    </w:p>
+    <w:p>
+      <w:pPr>
+        <w:pStyle w:val="RRAffirmation"/>
+      </w:pPr>
+      <w:r>
+        <w:t>“I can hold myself to account without putting myself on trial.”</w:t>
+      </w:r>
+    </w:p>
+    <w:p>
+      <w:pPr>
+        <w:pStyle w:val="RRAffirmation"/>
+      </w:pPr>
+      <w:r>
+        <w:t>“What I confess honestly, God meets with mercy — and mercy is something I can stop defending.”</w:t>
+      </w:r>
+    </w:p>
+    <w:p>
+      <w:pPr>
+        <w:pStyle w:val="RRSectionHead"/>
+      </w:pPr>
+      <w:r>
+        <w:t>Today’s Small Thing</w:t>
+      </w:r>
+    </w:p>
+    <w:p>
+      <w:pPr>
+        <w:pStyle w:val="RRBodyText2"/>
+      </w:pPr>
+      <w:r>
+        <w:t>Write the account. Twenty minutes, by hand, in three parts. Set a timer.</w:t>
+      </w:r>
+    </w:p>
+    <w:p>
+      <w:pPr>
+        <w:pStyle w:val="RRBodyText2"/>
+      </w:pPr>
+      <w:r>
+        <w:rPr>
+          <w:b/>
+        </w:rPr>
+        <w:t>Part one — the facts, in order.</w:t>
+      </w:r>
+      <w:r>
+        <w:t xml:space="preserve"> No interpretation, no adjectives. Dates, instrument, sizes, levels, times. What you did, in sequence, as a flight recorder would have it.</w:t>
+      </w:r>
+    </w:p>
+    <w:p>
+      <w:pPr>
+        <w:pStyle w:val="RRBodyText2"/>
+      </w:pPr>
+      <w:r>
+        <w:rPr>
+          <w:b/>
+        </w:rPr>
+        <w:t>Part two — what was mine.</w:t>
+      </w:r>
+      <w:r>
+        <w:t xml:space="preserve"> The decisions that were yours alone. Where you deviated from a rule you had written. What you knew at the time and did not act on. What you told yourself in the moment. Where you were tired, or angry, or trying to make back something earlier. Be specific enough that a stranger reading it could point to the exact decisions.</w:t>
+      </w:r>
+    </w:p>
+    <w:p>
+      <w:pPr>
+        <w:pStyle w:val="RRBodyText2"/>
+      </w:pPr>
+      <w:r>
+        <w:rPr>
+          <w:b/>
+        </w:rPr>
+        <w:t>Part three — what was not mine.</w:t>
+      </w:r>
+      <w:r>
+        <w:t xml:space="preserve"> Genuinely. Market conditions you could not have known. Events outside your control. This part is not consolation; it is accuracy, and an account that takes on more blame than is true is just as false as one that takes on less, and considerably more dangerous to a person in your condition.</w:t>
+      </w:r>
+    </w:p>
+    <w:p>
+      <w:pPr>
+        <w:pStyle w:val="RRBodyText2"/>
+      </w:pPr>
+      <w:r>
+        <w:t>Then close the notebook and do something physical for half an hour. Walk. Do not reread it today.</w:t>
+      </w:r>
+    </w:p>
+    <w:p>
+      <w:pPr>
+        <w:pStyle w:val="RRBodyText2"/>
+      </w:pPr>
+      <w:r>
+        <w:t>You will come back to this document on Day 22, and again in Appendix B. It becomes the foundation of your rebuild, and it is the most valuable thing you will produce this month.</w:t>
+      </w:r>
+    </w:p>
+    <w:p>
+      <w:pPr>
+        <w:pStyle w:val="RRSectionHead"/>
+      </w:pPr>
+      <w:r>
+        <w:t>Carry This</w:t>
+      </w:r>
+    </w:p>
+    <w:p>
+      <w:pPr>
+        <w:pStyle w:val="RRCarryThis"/>
+      </w:pPr>
+      <w:r>
+        <w:t>The account I have been giving is eighty per cent true, and the missing twenty per cent is the only part that can teach me anything.</w:t>
+      </w:r>
+    </w:p>
+    <w:p>
+      <w:pPr>
+        <w:pStyle w:val="RRBodyText2"/>
+        <w:spacing w:after="0"/>
+      </w:pPr>
+      <w:r>
+        <w:br w:type="page"/>
+      </w:r>
+    </w:p>
+    <w:p>
+      <w:pPr>
+        <w:pStyle w:val="RRDayKicker"/>
+      </w:pPr>
+      <w:r>
+        <w:t>Day 9</w:t>
+      </w:r>
+    </w:p>
+    <w:p>
+      <w:pPr>
+        <w:pStyle w:val="RRDayTitle"/>
+      </w:pPr>
+      <w:r>
+        <w:t>Letting Go Is a Decision, Not a Feeling</w:t>
+      </w:r>
+    </w:p>
+    <w:p>
+      <w:pPr>
+        <w:pStyle w:val="RRSectionHead"/>
+      </w:pPr>
+      <w:r>
+        <w:t>The Word</w:t>
+      </w:r>
+    </w:p>
+    <w:p>
+      <w:pPr>
+        <w:pStyle w:val="RRVerse"/>
+      </w:pPr>
+      <w:r>
+        <w:t>Brothers, I don’t regard myself as yet having taken hold, but one thing I do: forgetting the things which are behind and stretching forward to the things which are ahead, I press on toward the goal.</w:t>
+      </w:r>
+    </w:p>
+    <w:p>
+      <w:pPr>
+        <w:pStyle w:val="RRVerseRef"/>
+      </w:pPr>
+      <w:r>
+        <w:t>Philippians 3:13–14</w:t>
+      </w:r>
+    </w:p>
+    <w:p>
+      <w:pPr>
+        <w:pStyle w:val="RRSectionHead"/>
+      </w:pPr>
+      <w:r>
+        <w:t>Where You Are Today</w:t>
+      </w:r>
+    </w:p>
+    <w:p>
+      <w:pPr>
+        <w:pStyle w:val="RRBodyText2"/>
+      </w:pPr>
+      <w:r>
+        <w:t>You wrote it down yesterday, and something in you expected the writing to work like a discharge — that you would close the notebook and feel the pressure drop.</w:t>
+      </w:r>
+    </w:p>
+    <w:p>
+      <w:pPr>
+        <w:pStyle w:val="RRBodyText2"/>
+      </w:pPr>
+      <w:r>
+        <w:t xml:space="preserve">It did not drop. If anything you slept worse. And so you are back where you have been since about Day 3, waiting for a particular internal event to occur: the moment when it stops hurting enough that you can put it down. You are treating letting go as a </w:t>
+      </w:r>
+      <w:r>
+        <w:rPr>
+          <w:b/>
+        </w:rPr>
+        <w:t>feeling that will eventually arrive</w:t>
+      </w:r>
+      <w:r>
+        <w:t>, and you are waiting for its arrival before you allow yourself to move.</w:t>
+      </w:r>
+    </w:p>
+    <w:p>
+      <w:pPr>
+        <w:pStyle w:val="RRBodyText2"/>
+      </w:pPr>
+      <w:r>
+        <w:t>It is not going to arrive in that order. That is not how the mechanism runs, and today is about turning the sequence the right way round.</w:t>
+      </w:r>
+    </w:p>
+    <w:p>
+      <w:pPr>
+        <w:pStyle w:val="RRSectionHead"/>
+      </w:pPr>
+      <w:r>
+        <w:t>What Is Happening In Your Brain</w:t>
+      </w:r>
+    </w:p>
+    <w:p>
+      <w:pPr>
+        <w:pStyle w:val="RRBodyText2"/>
+      </w:pPr>
+      <w:r>
+        <w:t>Start with what does not work, because you have been doing it all week.</w:t>
+      </w:r>
+    </w:p>
+    <w:p>
+      <w:pPr>
+        <w:pStyle w:val="RRBodyText2"/>
+      </w:pPr>
+      <w:r>
+        <w:t xml:space="preserve">In a now-famous experiment, Daniel Wegner asked people not to think about a white bear. They were to ring a bell each time it came to mind. Not only did the bear come constantly, but afterwards — when the instruction was lifted — the suppression group thought about it </w:t>
+      </w:r>
+      <w:r>
+        <w:rPr>
+          <w:i/>
+        </w:rPr>
+        <w:t>more</w:t>
+      </w:r>
+      <w:r>
+        <w:t xml:space="preserve"> than people who had never been told to avoid it. Suppression produces rebound. The very act of monitoring for a thought keeps the thought active, because the monitor has to hold the target in mind in order to check for it.</w:t>
+      </w:r>
+    </w:p>
+    <w:p>
+      <w:pPr>
+        <w:pStyle w:val="RRBodyText2"/>
+      </w:pPr>
+      <w:r>
+        <w:t>Which explains something you have noticed. Every morning you resolve not to dwell on it. Every morning the resolution is the first thing that puts it in front of you.</w:t>
+      </w:r>
+    </w:p>
+    <w:p>
+      <w:pPr>
+        <w:pStyle w:val="RRBodyText2"/>
+      </w:pPr>
+      <w:r>
+        <w:t xml:space="preserve">Now the alternative, which comes out of Acceptance and Commitment Therapy — a body of work built by Steven Hayes and tested across hundreds of trials. Its central construct is </w:t>
+      </w:r>
+      <w:r>
+        <w:rPr>
+          <w:b/>
+        </w:rPr>
+        <w:t>psychological flexibility</w:t>
+      </w:r>
+      <w:r>
+        <w:t xml:space="preserve">: the ability to have an unpleasant internal experience </w:t>
+      </w:r>
+      <w:r>
+        <w:rPr>
+          <w:i/>
+        </w:rPr>
+        <w:t>while continuing to act in the direction you care about</w:t>
+      </w:r>
+      <w:r>
+        <w:t xml:space="preserve">. Its opposite, </w:t>
+      </w:r>
+      <w:r>
+        <w:rPr>
+          <w:b/>
+        </w:rPr>
+        <w:t>experiential avoidance</w:t>
+      </w:r>
+      <w:r>
+        <w:t>, is the habit of arranging your behaviour around not feeling bad — and experiential avoidance is one of the more reliable predictors of poor outcomes across a wide range of conditions.</w:t>
+      </w:r>
+    </w:p>
+    <w:p>
+      <w:pPr>
+        <w:pStyle w:val="RRBodyText2"/>
+      </w:pPr>
+      <w:r>
+        <w:t xml:space="preserve">The move ACT teaches is not to feel better before acting. It is to </w:t>
+      </w:r>
+      <w:r>
+        <w:rPr>
+          <w:b/>
+        </w:rPr>
+        <w:t>act while feeling badly</w:t>
+      </w:r>
+      <w:r>
+        <w:t xml:space="preserve"> — deliberately, in a chosen direction, with the discomfort fully present and unresolved.</w:t>
+      </w:r>
+    </w:p>
+    <w:p>
+      <w:pPr>
+        <w:pStyle w:val="RRBodyText2"/>
+      </w:pPr>
+      <w:r>
+        <w:t>So “letting go” is not the moment the grip releases. It is a decision you make, repeatedly, while the grip is still tight: the decision to stop organising your day around the loss. The feeling follows the behaviour, often by weeks. Anyone who has waited for the feeling first has waited a very long time.</w:t>
+      </w:r>
+    </w:p>
+    <w:p>
+      <w:pPr>
+        <w:pStyle w:val="RRBodyText2"/>
+      </w:pPr>
+      <w:r>
+        <w:t xml:space="preserve">There is a practical translation of this for you, and you will use it for the rest of your career. </w:t>
+      </w:r>
+      <w:r>
+        <w:rPr>
+          <w:b/>
+        </w:rPr>
+        <w:t>You do not need to feel confident in order to follow your process.</w:t>
+      </w:r>
+      <w:r>
+        <w:t xml:space="preserve"> That sentence is the whole of Day 21 in advance. The trader who requires a particular internal state before executing has made his edge conditional on his mood, and his mood is the least reliable instrument on the desk.</w:t>
+      </w:r>
+    </w:p>
+    <w:p>
+      <w:pPr>
+        <w:pStyle w:val="RRSectionHead"/>
+      </w:pPr>
+      <w:r>
+        <w:t>What the Word Says To It</w:t>
+      </w:r>
+    </w:p>
+    <w:p>
+      <w:pPr>
+        <w:pStyle w:val="RRBodyText2"/>
+      </w:pPr>
+      <w:r>
+        <w:t xml:space="preserve">Paul writes </w:t>
+      </w:r>
+      <w:r>
+        <w:rPr>
+          <w:i/>
+        </w:rPr>
+        <w:t>forgetting the things which are behind</w:t>
+      </w:r>
+      <w:r>
+        <w:t xml:space="preserve"> — and he is a man with a great deal behind him, some of it genuinely terrible. He had persecuted people. He had held the coats at a stoning. If anyone had material for a three-in-the-morning tape, it was him.</w:t>
+      </w:r>
+    </w:p>
+    <w:p>
+      <w:pPr>
+        <w:pStyle w:val="RRBodyText2"/>
+      </w:pPr>
+      <w:r>
+        <w:t xml:space="preserve">But look at the grammar. </w:t>
+      </w:r>
+      <w:r>
+        <w:rPr>
+          <w:b/>
+        </w:rPr>
+        <w:t>“One thing I do.”</w:t>
+      </w:r>
+      <w:r>
+        <w:t xml:space="preserve"> Not one thing I feel. Not one thing I have finally been released from. A verb of action, in the present continuous, from a man who begins the sentence by admitting </w:t>
+      </w:r>
+      <w:r>
+        <w:rPr>
+          <w:i/>
+        </w:rPr>
+        <w:t>I don’t regard myself as yet having taken hold</w:t>
+      </w:r>
+      <w:r>
+        <w:t xml:space="preserve"> — that is, he explicitly denies having arrived.</w:t>
+      </w:r>
+    </w:p>
+    <w:p>
+      <w:pPr>
+        <w:pStyle w:val="RRBodyText2"/>
+      </w:pPr>
+      <w:r>
+        <w:t xml:space="preserve">And the image he chooses is athletic: </w:t>
+      </w:r>
+      <w:r>
+        <w:rPr>
+          <w:i/>
+        </w:rPr>
+        <w:t>stretching forward</w:t>
+      </w:r>
+      <w:r>
+        <w:t>, the word for a runner leaning into the tape, whole body committed to a direction. That is not a description of an inner state. It is a description of a posture chosen and held.</w:t>
+      </w:r>
+    </w:p>
+    <w:p>
+      <w:pPr>
+        <w:pStyle w:val="RRBodyText2"/>
+      </w:pPr>
+      <w:r>
+        <w:t xml:space="preserve">Notice too that forgetting, here, is not amnesia. Paul rehearses his own past in his letters when it serves. What he refuses is the past as a </w:t>
+      </w:r>
+      <w:r>
+        <w:rPr>
+          <w:i/>
+        </w:rPr>
+        <w:t>place to live</w:t>
+      </w:r>
+      <w:r>
+        <w:t>. He has decided which direction his weight is going, and he redecides it, evidently, on days when he does not feel like it — which is why he keeps writing about it.</w:t>
+      </w:r>
+    </w:p>
+    <w:p>
+      <w:pPr>
+        <w:pStyle w:val="RRBodyText2"/>
+      </w:pPr>
+      <w:r>
+        <w:t>The permission in this verse is large: you may press on without having taken hold. You may run before the grief is finished. You are not required to be free in order to move.</w:t>
+      </w:r>
+    </w:p>
+    <w:p>
+      <w:pPr>
+        <w:pStyle w:val="RRSectionHead"/>
+      </w:pPr>
+      <w:r>
+        <w:t>The Meditation</w:t>
+      </w:r>
+    </w:p>
+    <w:p>
+      <w:pPr>
+        <w:pStyle w:val="RRMeditation"/>
+      </w:pPr>
+      <w:r>
+        <w:t>Four minutes. Sit. Feet flat.</w:t>
+      </w:r>
+    </w:p>
+    <w:p>
+      <w:pPr>
+        <w:pStyle w:val="RRMeditation"/>
+      </w:pPr>
+      <w:r>
+        <w:t>Breathe in for four, out for six, six times.</w:t>
+      </w:r>
+    </w:p>
+    <w:p>
+      <w:pPr>
+        <w:pStyle w:val="RRMeditation"/>
+      </w:pPr>
+      <w:r>
+        <w:t>Now, deliberately, invite the thing in. Let the loss be present — the number, the memory, the fear. Do not push it away and do not engage with it. Picture it as an object placed beside you on the floor. Heavy, real, not going anywhere today.</w:t>
+      </w:r>
+    </w:p>
+    <w:p>
+      <w:pPr>
+        <w:pStyle w:val="RRMeditation"/>
+      </w:pPr>
+      <w:r>
+        <w:t xml:space="preserve">Say inwardly: </w:t>
+      </w:r>
+      <w:r>
+        <w:rPr>
+          <w:i/>
+        </w:rPr>
+        <w:t>“You can stay. I am not fighting you today.”</w:t>
+      </w:r>
+    </w:p>
+    <w:p>
+      <w:pPr>
+        <w:pStyle w:val="RRMeditation"/>
+      </w:pPr>
+      <w:r>
+        <w:t>Then, with it still there, say the second half:</w:t>
+      </w:r>
+    </w:p>
+    <w:p>
+      <w:pPr>
+        <w:pStyle w:val="RRMeditation"/>
+      </w:pPr>
+      <w:r>
+        <w:rPr>
+          <w:i/>
+        </w:rPr>
+        <w:t>“And I am going forward anyway.”</w:t>
+      </w:r>
+    </w:p>
+    <w:p>
+      <w:pPr>
+        <w:pStyle w:val="RRMeditation"/>
+      </w:pPr>
+      <w:r>
+        <w:t>Sit for a full minute with both of those true at once — the weight beside you, and your intention pointed elsewhere. That coexistence is the skill. Not the removal of the weight. The coexistence.</w:t>
+      </w:r>
+    </w:p>
+    <w:p>
+      <w:pPr>
+        <w:pStyle w:val="RRMeditation"/>
+      </w:pPr>
+      <w:r>
+        <w:t xml:space="preserve">Close with: </w:t>
+      </w:r>
+      <w:r>
+        <w:rPr>
+          <w:i/>
+        </w:rPr>
+        <w:t>“One thing I do.”</w:t>
+      </w:r>
+      <w:r>
+        <w:t xml:space="preserve"> One long exhale.</w:t>
+      </w:r>
+    </w:p>
+    <w:p>
+      <w:pPr>
+        <w:pStyle w:val="RRSectionHead"/>
+      </w:pPr>
+      <w:r>
+        <w:t>Say It Out Loud</w:t>
+      </w:r>
+    </w:p>
+    <w:p>
+      <w:pPr>
+        <w:pStyle w:val="RRAffirmation"/>
+      </w:pPr>
+      <w:r>
+        <w:t>“I do not have to feel free in order to move forward, and I am moving forward today.”</w:t>
+      </w:r>
+    </w:p>
+    <w:p>
+      <w:pPr>
+        <w:pStyle w:val="RRAffirmation"/>
+      </w:pPr>
+      <w:r>
+        <w:t>“I can carry this and still do the next right thing.”</w:t>
+      </w:r>
+    </w:p>
+    <w:p>
+      <w:pPr>
+        <w:pStyle w:val="RRAffirmation"/>
+      </w:pPr>
+      <w:r>
+        <w:t>“I press on before I have taken hold, because that is what pressing on means.”</w:t>
+      </w:r>
+    </w:p>
+    <w:p>
+      <w:pPr>
+        <w:pStyle w:val="RRSectionHead"/>
+      </w:pPr>
+      <w:r>
+        <w:t>Today’s Small Thing</w:t>
+      </w:r>
+    </w:p>
+    <w:p>
+      <w:pPr>
+        <w:pStyle w:val="RRBodyText2"/>
+      </w:pPr>
+      <w:r>
+        <w:t>Do one thing you have been postponing until you “feel better”.</w:t>
+      </w:r>
+    </w:p>
+    <w:p>
+      <w:pPr>
+        <w:pStyle w:val="RRBodyText2"/>
+      </w:pPr>
+      <w:r>
+        <w:t>Not a trading task. A life task — the gym session you have skipped for two weeks, the call to your mother, the drawer of paperwork, the run you used to do on Thursdays. Choose something small and physical and unrelated to markets.</w:t>
+      </w:r>
+    </w:p>
+    <w:p>
+      <w:pPr>
+        <w:pStyle w:val="RRBodyText2"/>
+      </w:pPr>
+      <w:r>
+        <w:t xml:space="preserve">Do it badly. Do it while feeling awful. Then note, in the notebook, one line: </w:t>
+      </w:r>
+      <w:r>
+        <w:rPr>
+          <w:i/>
+        </w:rPr>
+        <w:t>Did it. Still felt bad. Did it anyway.</w:t>
+      </w:r>
+    </w:p>
+    <w:p>
+      <w:pPr>
+        <w:pStyle w:val="RRBodyText2"/>
+      </w:pPr>
+      <w:r>
+        <w:t>That line is your first piece of evidence in a file we are going to build all month: proof that your actions are no longer downstream of your mood.</w:t>
+      </w:r>
+    </w:p>
+    <w:p>
+      <w:pPr>
+        <w:pStyle w:val="RRSectionHead"/>
+      </w:pPr>
+      <w:r>
+        <w:t>Carry This</w:t>
+      </w:r>
+    </w:p>
+    <w:p>
+      <w:pPr>
+        <w:pStyle w:val="RRCarryThis"/>
+      </w:pPr>
+      <w:r>
+        <w:t>I have been waiting to feel ready, and readiness has never once been the thing that arrives first.</w:t>
+      </w:r>
+    </w:p>
+    <w:p>
+      <w:pPr>
+        <w:pStyle w:val="RRBodyText2"/>
+        <w:spacing w:after="0"/>
+      </w:pPr>
+      <w:r>
+        <w:br w:type="page"/>
+      </w:r>
+    </w:p>
+    <w:p>
+      <w:pPr>
+        <w:pStyle w:val="RRDayKicker"/>
+      </w:pPr>
+      <w:r>
+        <w:t>Day 10</w:t>
+      </w:r>
+    </w:p>
+    <w:p>
+      <w:pPr>
+        <w:pStyle w:val="RRDayTitle"/>
+      </w:pPr>
+      <w:r>
+        <w:t>Bury It Properly</w:t>
+      </w:r>
+    </w:p>
+    <w:p>
+      <w:pPr>
+        <w:pStyle w:val="RRSectionHead"/>
+      </w:pPr>
+      <w:r>
+        <w:t>The Word</w:t>
+      </w:r>
+    </w:p>
+    <w:p>
+      <w:pPr>
+        <w:pStyle w:val="RRVerse"/>
+      </w:pPr>
+      <w:r>
+        <w:t>Take up twelve stones out of the middle of the Jordan … and carry them over with you, and lay them down in the place where you will lodge tonight … that this may be a sign among you, that when your children ask in time to come, saying, “What do you mean by these stones?” then you shall tell them.</w:t>
+      </w:r>
+    </w:p>
+    <w:p>
+      <w:pPr>
+        <w:pStyle w:val="RRVerseRef"/>
+      </w:pPr>
+      <w:r>
+        <w:t>Joshua 4:3, 6–7</w:t>
+      </w:r>
+    </w:p>
+    <w:p>
+      <w:pPr>
+        <w:pStyle w:val="RRSectionHead"/>
+      </w:pPr>
+      <w:r>
+        <w:t>Where You Are Today</w:t>
+      </w:r>
+    </w:p>
+    <w:p>
+      <w:pPr>
+        <w:pStyle w:val="RRBodyText2"/>
+      </w:pPr>
+      <w:r>
+        <w:t>Ten days.</w:t>
+      </w:r>
+    </w:p>
+    <w:p>
+      <w:pPr>
+        <w:pStyle w:val="RRBodyText2"/>
+      </w:pPr>
+      <w:r>
+        <w:t>Ten days ago you could not have read a page of this without your eyes sliding off it. You have named what you feel. You have separated the act from the person. You have written the honest account, which most people never do, and you have made the decision to move before the feeling arrived.</w:t>
+      </w:r>
+    </w:p>
+    <w:p>
+      <w:pPr>
+        <w:pStyle w:val="RRBodyText2"/>
+      </w:pPr>
+      <w:r>
+        <w:t>And yet there is something still walking about the house. The loss has no resting place. It comes and goes as it likes, at three in the morning and in the supermarket queue, because nothing has ever formally concluded. There has been no funeral. Nobody said the words, nobody put anything in the ground, and so a part of you is still, technically, in the middle of it.</w:t>
+      </w:r>
+    </w:p>
+    <w:p>
+      <w:pPr>
+        <w:pStyle w:val="RRBodyText2"/>
+      </w:pPr>
+      <w:r>
+        <w:t xml:space="preserve">Today we end it. Not the grief — grief will keep arriving in waves for a while yet, and Day 2 told you to expect that. What ends today is the </w:t>
+      </w:r>
+      <w:r>
+        <w:rPr>
+          <w:i/>
+        </w:rPr>
+        <w:t>open state</w:t>
+      </w:r>
+      <w:r>
+        <w:t>. Today you give it a date and a place.</w:t>
+      </w:r>
+    </w:p>
+    <w:p>
+      <w:pPr>
+        <w:pStyle w:val="RRSectionHead"/>
+      </w:pPr>
+      <w:r>
+        <w:t>What Is Happening In Your Brain</w:t>
+      </w:r>
+    </w:p>
+    <w:p>
+      <w:pPr>
+        <w:pStyle w:val="RRBodyText2"/>
+      </w:pPr>
+      <w:r>
+        <w:t>There is a serious literature on this, and its findings surprise nearly everyone who encounters them.</w:t>
+      </w:r>
+    </w:p>
+    <w:p>
+      <w:pPr>
+        <w:pStyle w:val="RRBodyText2"/>
+      </w:pPr>
+      <w:r>
+        <w:t xml:space="preserve">Michael Norton and Francesca Gino ran a set of studies on people who had suffered losses — bereavements and the ends of relationships. Some were asked to perform a </w:t>
+      </w:r>
+      <w:r>
+        <w:rPr>
+          <w:b/>
+        </w:rPr>
+        <w:t>ritual</w:t>
+      </w:r>
+      <w:r>
+        <w:t>: a small, structured, deliberate act connected to the loss. Others were not. The ritual group reported significantly less grief.</w:t>
+      </w:r>
+    </w:p>
+    <w:p>
+      <w:pPr>
+        <w:pStyle w:val="RRBodyText2"/>
+      </w:pPr>
+      <w:r>
+        <w:t xml:space="preserve">The striking part is what happened next. The researchers tested rituals that were entirely </w:t>
+      </w:r>
+      <w:r>
+        <w:rPr>
+          <w:b/>
+        </w:rPr>
+        <w:t>arbitrary</w:t>
+      </w:r>
+      <w:r>
+        <w:t xml:space="preserve"> — invented procedures with no cultural meaning whatsoever, performed by people who, when asked, said they did not believe rituals worked. The effect held. Something about the </w:t>
+      </w:r>
+      <w:r>
+        <w:rPr>
+          <w:i/>
+        </w:rPr>
+        <w:t>structure</w:t>
+      </w:r>
+      <w:r>
+        <w:t xml:space="preserve"> of the act itself was doing the work, independent of belief in it.</w:t>
+      </w:r>
+    </w:p>
+    <w:p>
+      <w:pPr>
+        <w:pStyle w:val="RRBodyText2"/>
+      </w:pPr>
+      <w:r>
+        <w:t xml:space="preserve">Their explanation, supported by follow-up work, is that loss is fundamentally an experience of </w:t>
+      </w:r>
+      <w:r>
+        <w:rPr>
+          <w:b/>
+        </w:rPr>
+        <w:t>lost control</w:t>
+      </w:r>
+      <w:r>
+        <w:t>, and a ritual is an act of deliberate, sequenced control performed at the exact site of that helplessness. You could not choose what happened to you. You can choose this, precisely, in order, at a time you name.</w:t>
+      </w:r>
+    </w:p>
+    <w:p>
+      <w:pPr>
+        <w:pStyle w:val="RRBodyText2"/>
+      </w:pPr>
+      <w:r>
+        <w:t xml:space="preserve">There is a second mechanism worth knowing, and it is why today comes </w:t>
+      </w:r>
+      <w:r>
+        <w:rPr>
+          <w:i/>
+        </w:rPr>
+        <w:t>after</w:t>
+      </w:r>
+      <w:r>
+        <w:t xml:space="preserve"> Day 8 rather than before it. Memory is not a recording; every time you bring an experience to mind it becomes briefly editable before it is stored again. What gets re-stored is influenced by the context in which you retrieved it. Retrieve this loss ten more times at three in the morning in a state of dread, and you consolidate ten more copies of a dread-soaked memory. Retrieve it once, deliberately, in daylight, inside a chosen and dignified act — and you give the memory a different final frame.</w:t>
+      </w:r>
+    </w:p>
+    <w:p>
+      <w:pPr>
+        <w:pStyle w:val="RRBodyText2"/>
+      </w:pPr>
+      <w:r>
+        <w:t>You are not erasing anything today. You are deciding what the last scene looks like.</w:t>
+      </w:r>
+    </w:p>
+    <w:p>
+      <w:pPr>
+        <w:pStyle w:val="RRSectionHead"/>
+      </w:pPr>
+      <w:r>
+        <w:t>What the Word Says To It</w:t>
+      </w:r>
+    </w:p>
+    <w:p>
+      <w:pPr>
+        <w:pStyle w:val="RRBodyText2"/>
+      </w:pPr>
+      <w:r>
+        <w:t>Israel crosses the Jordan, and the first thing God commands on the other side is not a battle plan. It is masonry.</w:t>
+      </w:r>
+    </w:p>
+    <w:p>
+      <w:pPr>
+        <w:pStyle w:val="RRBodyText2"/>
+      </w:pPr>
+      <w:r>
+        <w:t xml:space="preserve">Twelve stones, hauled up out of the riverbed by twelve men, and stacked at the place where they camped that night. A pile of rocks. Militarily useless. And the reason given is entirely about </w:t>
+      </w:r>
+      <w:r>
+        <w:rPr>
+          <w:b/>
+        </w:rPr>
+        <w:t>memory</w:t>
+      </w:r>
+      <w:r>
+        <w:t>: so that when your children ask what these mean, you will have to tell them the story.</w:t>
+      </w:r>
+    </w:p>
+    <w:p>
+      <w:pPr>
+        <w:pStyle w:val="RRBodyText2"/>
+      </w:pPr>
+      <w:r>
+        <w:t>Notice three things about that memorial, because your own is going to need all three.</w:t>
+      </w:r>
+    </w:p>
+    <w:p>
+      <w:pPr>
+        <w:pStyle w:val="RRBodyText2"/>
+      </w:pPr>
+      <w:r>
+        <w:t xml:space="preserve">It is </w:t>
+      </w:r>
+      <w:r>
+        <w:rPr>
+          <w:b/>
+        </w:rPr>
+        <w:t>physical</w:t>
+      </w:r>
+      <w:r>
+        <w:t>. Not a resolution, not a private intention — stones, with weight, that had to be carried on somebody’s shoulder. The body has to participate or nothing is marked.</w:t>
+      </w:r>
+    </w:p>
+    <w:p>
+      <w:pPr>
+        <w:pStyle w:val="RRBodyText2"/>
+      </w:pPr>
+      <w:r>
+        <w:t xml:space="preserve">It is </w:t>
+      </w:r>
+      <w:r>
+        <w:rPr>
+          <w:b/>
+        </w:rPr>
+        <w:t>located</w:t>
+      </w:r>
+      <w:r>
+        <w:t>. In the place where you will lodge tonight. Grief that has no address wanders; grief with an address can be visited, which means it can also be left.</w:t>
+      </w:r>
+    </w:p>
+    <w:p>
+      <w:pPr>
+        <w:pStyle w:val="RRBodyText2"/>
+      </w:pPr>
+      <w:r>
+        <w:t xml:space="preserve">And it is </w:t>
+      </w:r>
+      <w:r>
+        <w:rPr>
+          <w:b/>
+        </w:rPr>
+        <w:t>honest</w:t>
+      </w:r>
+      <w:r>
+        <w:t>. The stones commemorate a crossing that included forty years of failure in the wilderness. This is not a monument to Israel’s competence. It is a monument to what happened, the shameful parts included, and to who brought them through anyway.</w:t>
+      </w:r>
+    </w:p>
+    <w:p>
+      <w:pPr>
+        <w:pStyle w:val="RRBodyText2"/>
+      </w:pPr>
+      <w:r>
+        <w:t xml:space="preserve">That is what you are building today. Not a monument to your loss, and not a headstone for your career. A marker that says: </w:t>
+      </w:r>
+      <w:r>
+        <w:rPr>
+          <w:i/>
+        </w:rPr>
+        <w:t>this happened here, it was real, it cost this much, and I came up out of it on this date.</w:t>
+      </w:r>
+    </w:p>
+    <w:p>
+      <w:pPr>
+        <w:pStyle w:val="RRSectionHead"/>
+      </w:pPr>
+      <w:r>
+        <w:t>The Meditation</w:t>
+      </w:r>
+    </w:p>
+    <w:p>
+      <w:pPr>
+        <w:pStyle w:val="RRMeditation"/>
+      </w:pPr>
+      <w:r>
+        <w:t>Longer today — six minutes — and it comes before the small thing rather than after it.</w:t>
+      </w:r>
+    </w:p>
+    <w:p>
+      <w:pPr>
+        <w:pStyle w:val="RRMeditation"/>
+      </w:pPr>
+      <w:r>
+        <w:t>Sit somewhere you will not be interrupted. Have the notebook from Day 8 beside you, closed.</w:t>
+      </w:r>
+    </w:p>
+    <w:p>
+      <w:pPr>
+        <w:pStyle w:val="RRMeditation"/>
+      </w:pPr>
+      <w:r>
+        <w:t>Breathe in for four, out for six. Ten times.</w:t>
+      </w:r>
+    </w:p>
+    <w:p>
+      <w:pPr>
+        <w:pStyle w:val="RRMeditation"/>
+      </w:pPr>
+      <w:r>
+        <w:t xml:space="preserve">Now walk through it once, deliberately, in daylight. Not the tape — you are not looking for what you should have done. You are simply visiting: </w:t>
+      </w:r>
+      <w:r>
+        <w:rPr>
+          <w:i/>
+        </w:rPr>
+        <w:t>this is what happened to me. This is what it cost. This is what I lost, including the parts that were not money.</w:t>
+      </w:r>
+      <w:r>
+        <w:t xml:space="preserve"> Take a full minute. Let it be as heavy as it actually is.</w:t>
+      </w:r>
+    </w:p>
+    <w:p>
+      <w:pPr>
+        <w:pStyle w:val="RRMeditation"/>
+      </w:pPr>
+      <w:r>
+        <w:t>Then say, out loud:</w:t>
+      </w:r>
+    </w:p>
+    <w:p>
+      <w:pPr>
+        <w:pStyle w:val="RRMeditation"/>
+      </w:pPr>
+      <w:r>
+        <w:rPr>
+          <w:i/>
+        </w:rPr>
+        <w:t>“It is finished, and I am not.”</w:t>
+      </w:r>
+    </w:p>
+    <w:p>
+      <w:pPr>
+        <w:pStyle w:val="RRMeditation"/>
+      </w:pPr>
+      <w:r>
+        <w:t xml:space="preserve">Then name the date. Say the actual date aloud — </w:t>
+      </w:r>
+      <w:r>
+        <w:rPr>
+          <w:i/>
+        </w:rPr>
+        <w:t>today is the ______, and this is where I put it down.</w:t>
+      </w:r>
+    </w:p>
+    <w:p>
+      <w:pPr>
+        <w:pStyle w:val="RRMeditation"/>
+      </w:pPr>
+      <w:r>
+        <w:t>Sit in the silence afterwards for thirty seconds without doing anything with it.</w:t>
+      </w:r>
+    </w:p>
+    <w:p>
+      <w:pPr>
+        <w:pStyle w:val="RRMeditation"/>
+      </w:pPr>
+      <w:r>
+        <w:t>Close with one long exhale.</w:t>
+      </w:r>
+    </w:p>
+    <w:p>
+      <w:pPr>
+        <w:pStyle w:val="RRSectionHead"/>
+      </w:pPr>
+      <w:r>
+        <w:t>Say It Out Loud</w:t>
+      </w:r>
+    </w:p>
+    <w:p>
+      <w:pPr>
+        <w:pStyle w:val="RRAffirmation"/>
+      </w:pPr>
+      <w:r>
+        <w:t>“This happened, it was as bad as I have said, and today it stops being an open wound and becomes a marked place.”</w:t>
+      </w:r>
+    </w:p>
+    <w:p>
+      <w:pPr>
+        <w:pStyle w:val="RRAffirmation"/>
+      </w:pPr>
+      <w:r>
+        <w:t>“I did not choose the loss; I am choosing how it ends.”</w:t>
+      </w:r>
+    </w:p>
+    <w:p>
+      <w:pPr>
+        <w:pStyle w:val="RRAffirmation"/>
+      </w:pPr>
+      <w:r>
+        <w:t>“God brought me up out of the riverbed, and I am stacking the stones to say so.”</w:t>
+      </w:r>
+    </w:p>
+    <w:p>
+      <w:pPr>
+        <w:pStyle w:val="RRSectionHead"/>
+      </w:pPr>
+      <w:r>
+        <w:t>Today’s Small Thing</w:t>
+      </w:r>
+    </w:p>
+    <w:p>
+      <w:pPr>
+        <w:pStyle w:val="RRBodyText2"/>
+      </w:pPr>
+      <w:r>
+        <w:t>Build the memorial. Today, not tomorrow, and physically.</w:t>
+      </w:r>
+    </w:p>
+    <w:p>
+      <w:pPr>
+        <w:pStyle w:val="RRBodyText2"/>
+      </w:pPr>
+      <w:r>
+        <w:t>Choose your own form — it must involve your hands, and it must be something you can point at afterwards:</w:t>
+      </w:r>
+    </w:p>
+    <w:p>
+      <w:pPr>
+        <w:pStyle w:val="RRBulletItem"/>
+      </w:pPr>
+      <w:r>
+        <w:t>•  Take the Day 8 account, seal it in an envelope, write the date on the front, and put it somewhere deliberate and out of reach. It is not destroyed; it is filed. You will open it on Day 22.</w:t>
+      </w:r>
+    </w:p>
+    <w:p>
+      <w:pPr>
+        <w:pStyle w:val="RRBulletItem"/>
+      </w:pPr>
+      <w:r>
+        <w:t>•  Or find a stone — a real one, outdoors — write the date on it, and put it on your desk where you will see it every trading day for the rest of your life.</w:t>
+      </w:r>
+    </w:p>
+    <w:p>
+      <w:pPr>
+        <w:pStyle w:val="RRBulletItem"/>
+      </w:pPr>
+      <w:r>
+        <w:t>•  Or go somewhere with a view, alone, on purpose, and say the words there.</w:t>
+      </w:r>
+    </w:p>
+    <w:p>
+      <w:pPr>
+        <w:pStyle w:val="RRBodyText2"/>
+      </w:pPr>
+      <w:r>
+        <w:t xml:space="preserve">Whatever form you choose, do these two things: </w:t>
+      </w:r>
+      <w:r>
+        <w:rPr>
+          <w:b/>
+        </w:rPr>
+        <w:t>say the date out loud</w:t>
+      </w:r>
+      <w:r>
+        <w:t xml:space="preserve">, and </w:t>
+      </w:r>
+      <w:r>
+        <w:rPr>
+          <w:b/>
+        </w:rPr>
+        <w:t>tell one person you did it</w:t>
+      </w:r>
+      <w:r>
+        <w:t>.</w:t>
+      </w:r>
+    </w:p>
+    <w:p>
+      <w:pPr>
+        <w:pStyle w:val="RRBodyText2"/>
+      </w:pPr>
+      <w:r>
+        <w:t>Then tomorrow we begin the rebuild, and you begin it from the other side of a line that exists.</w:t>
+      </w:r>
+    </w:p>
+    <w:p>
+      <w:pPr>
+        <w:pStyle w:val="RRSectionHead"/>
+      </w:pPr>
+      <w:r>
+        <w:t>Carry This</w:t>
+      </w:r>
+    </w:p>
+    <w:p>
+      <w:pPr>
+        <w:pStyle w:val="RRCarryThis"/>
+      </w:pPr>
+      <w:r>
+        <w:t>Today I stopped being someone this is happening to, and became someone it happened to.</w:t>
       </w:r>
     </w:p>
     <w:sectPr>

</xml_diff>

<commit_message>
Set the author byline and document metadata
Fills in the title-page placeholder with the author name and credential line.

- New RRBookCredential style and a #### branch on title pages, so the
  credential sits under the name at a smaller, lighter weight instead of
  falling through to the 12.5pt italic tagline style.
- Byline colour moved from muted grey to full ink so the name carries the
  page and the credential recedes behind it.
- DOCX core properties now carry the title, subtitle and author, driven by
  constants at the top of build.py. The PDF previously reported its author
  as python-docx, which would have travelled with any copy sent to an
  editor or printer.

Co-Authored-By: Claude Opus 5 <noreply@anthropic.com>
Claude-Session: https://claude.ai/code/session_01UeeFz7e94QqjkRfBrfFPt4
</commit_message>
<xml_diff>
--- a/dist/restore-and-rebuild.docx
+++ b/dist/restore-and-rebuild.docx
@@ -56,7 +56,15 @@
         <w:pStyle w:val="RRBookByline"/>
       </w:pPr>
       <w:r>
-        <w:t>[ Author Name ]</w:t>
+        <w:t>Billy Ribeiro</w:t>
+      </w:r>
+    </w:p>
+    <w:p>
+      <w:pPr>
+        <w:pStyle w:val="RRBookCredential"/>
+      </w:pPr>
+      <w:r>
+        <w:t>Professional Trader · Mentor · CMT</w:t>
       </w:r>
     </w:p>
     <w:p>
@@ -35907,9 +35915,27 @@
       <w:b w:val="0"/>
       <w:i w:val="0"/>
       <w:caps/>
-      <w:color w:val="5A5A5A"/>
+      <w:color w:val="1A1A1A"/>
       <w:sz w:val="22"/>
       <w:spacing w:val="30"/>
+    </w:rPr>
+  </w:style>
+  <w:style w:type="paragraph" w:customStyle="1" w:styleId="RRBookCredential">
+    <w:name w:val="RRBookCredential"/>
+    <w:basedOn w:val="Normal"/>
+    <w:pPr>
+      <w:spacing w:before="140" w:after="0" w:line="312" w:lineRule="auto"/>
+      <w:jc w:val="center"/>
+      <w:widowControl w:val="true"/>
+    </w:pPr>
+    <w:rPr>
+      <w:rFonts w:ascii="Georgia" w:hAnsi="Georgia" w:cs="Georgia"/>
+      <w:b w:val="0"/>
+      <w:i w:val="0"/>
+      <w:caps/>
+      <w:color w:val="5A5A5A"/>
+      <w:sz w:val="17"/>
+      <w:spacing w:val="25"/>
     </w:rPr>
   </w:style>
   <w:style w:type="paragraph" w:customStyle="1" w:styleId="RRPartKicker">

</xml_diff>